<commit_message>
Finalize hosted PayLink evidence, editable design, reports, and team recording guide
</commit_message>
<xml_diff>
--- a/docs/database-design.docx
+++ b/docs/database-design.docx
@@ -2,27 +2,38 @@
 <file path=word/document.xml><?xml version="1.0" encoding="utf-8"?>
 <w:document xmlns:w="http://schemas.openxmlformats.org/wordprocessingml/2006/main" xmlns:m="http://schemas.openxmlformats.org/officeDocument/2006/math" xmlns:r="http://schemas.openxmlformats.org/officeDocument/2006/relationships" xmlns:o="urn:schemas-microsoft-com:office:office" xmlns:v="urn:schemas-microsoft-com:vml" xmlns:w10="urn:schemas-microsoft-com:office:word" xmlns:a="http://schemas.openxmlformats.org/drawingml/2006/main" xmlns:pic="http://schemas.openxmlformats.org/drawingml/2006/picture" xmlns:wp="http://schemas.openxmlformats.org/drawingml/2006/wordprocessingDrawing">
   <w:body>
-    <w:bookmarkStart w:id="30" w:name="paylink-database-design"/>
     <w:p>
       <w:pPr>
         <w:pStyle w:val="Heading1"/>
-      </w:pPr>
-      <w:r>
+        <w:widowControl/>
+      </w:pPr>
+      <w:bookmarkStart w:id="9" w:name="_6da6869144edb9ce6d373ef47ee0b74768dea4a"/>
+      <w:r>
+        <w:rPr>
+          <w:color w:val="000000"/>
+        </w:rPr>
         <w:t xml:space="preserve">PayLink database design</w:t>
       </w:r>
-    </w:p>
-    <w:bookmarkStart w:id="20" w:name="scope-and-assumptions"/>
+      <w:bookmarkEnd w:id="9"/>
+    </w:p>
     <w:p>
       <w:pPr>
         <w:pStyle w:val="Heading2"/>
-      </w:pPr>
-      <w:r>
+        <w:widowControl/>
+      </w:pPr>
+      <w:bookmarkStart w:id="10" w:name="_458defeb31fdf94e6bce83d1b00aef1a22e7794"/>
+      <w:r>
+        <w:rPr>
+          <w:color w:val="000000"/>
+        </w:rPr>
         <w:t xml:space="preserve">Scope and assumptions</w:t>
       </w:r>
+      <w:bookmarkEnd w:id="10"/>
     </w:p>
     <w:p>
       <w:pPr>
         <w:pStyle w:val="FirstParagraph"/>
+        <w:widowControl/>
       </w:pPr>
       <w:r>
         <w:t xml:space="preserve">PayLink is a</w:t>
@@ -44,9 +55,10 @@
     <w:p>
       <w:pPr>
         <w:pStyle w:val="BodyText"/>
-      </w:pPr>
-      <w:r>
-        <w:t xml:space="preserve">The application schema has exactly five base relations, matching the proposal.</w:t>
+        <w:widowControl/>
+      </w:pPr>
+      <w:r>
+        <w:t xml:space="preserve">The application schema has exactly five base relations, matching the proposal. It runs on hosted Supabase PostgreSQL 17.11 in primary-org/paylink; independent Mac integration tests use isolated Homebrew PostgreSQL 16.15.</w:t>
       </w:r>
       <w:r>
         <w:t xml:space="preserve"> </w:t>
@@ -79,19 +91,24 @@
         <w:t xml:space="preserve">is private: it must not be added to the exposed Supabase Data API schemas.</w:t>
       </w:r>
     </w:p>
-    <w:bookmarkEnd w:id="20"/>
-    <w:bookmarkStart w:id="21" w:name="editable-conceptual-and-logical-model"/>
     <w:p>
       <w:pPr>
         <w:pStyle w:val="Heading2"/>
-      </w:pPr>
-      <w:r>
+        <w:widowControl/>
+      </w:pPr>
+      <w:bookmarkStart w:id="11" w:name="_f7600047fb686525b750cb9eeae639addebed79"/>
+      <w:r>
+        <w:rPr>
+          <w:color w:val="000000"/>
+        </w:rPr>
         <w:t xml:space="preserve">Editable conceptual and logical model</w:t>
       </w:r>
+      <w:bookmarkEnd w:id="11"/>
     </w:p>
     <w:p>
       <w:pPr>
         <w:pStyle w:val="FirstParagraph"/>
+        <w:widowControl/>
       </w:pPr>
       <w:r>
         <w:t xml:space="preserve">Open</w:t>
@@ -189,9 +206,22 @@
       <w:tblPr>
         <w:tblStyle w:val="Table"/>
         <w:tblW w:type="pct" w:w="5000"/>
-        <w:jc w:val="left"/>
         <w:tblLayout w:type="fixed"/>
         <w:tblLook w:firstRow="1" w:lastRow="0" w:firstColumn="0" w:lastColumn="0" w:noHBand="0" w:noVBand="0" w:val="0020"/>
+        <w:tblBorders>
+          <w:top w:val="single" w:sz="4" w:color="D9D9D9"/>
+          <w:left w:val="single" w:sz="4" w:color="D9D9D9"/>
+          <w:bottom w:val="single" w:sz="4" w:color="D9D9D9"/>
+          <w:right w:val="single" w:sz="4" w:color="D9D9D9"/>
+          <w:insideH w:val="single" w:sz="4" w:color="D9D9D9"/>
+          <w:insideV w:val="single" w:sz="4" w:color="D9D9D9"/>
+        </w:tblBorders>
+        <w:tblCellMar>
+          <w:top w:w="90" w:type="dxa"/>
+          <w:left w:w="90" w:type="dxa"/>
+          <w:bottom w:w="90" w:type="dxa"/>
+          <w:right w:w="90" w:type="dxa"/>
+        </w:tblCellMar>
       </w:tblPr>
       <w:tblGrid>
         <w:gridCol w:w="2640"/>
@@ -201,304 +231,534 @@
       <w:tr>
         <w:trPr>
           <w:tblHeader w:val="on"/>
+          <w:cantSplit/>
+          <w:tblHeader/>
         </w:trPr>
         <w:tc>
-          <w:tcPr/>
+          <w:tcPr>
+            <w:vAlign w:val="center"/>
+            <w:shd w:fill="EAF0FC"/>
+          </w:tcPr>
           <w:p>
             <w:pPr>
               <w:pStyle w:val="Compact"/>
-              <w:jc w:val="left"/>
+              <w:spacing w:after="60" w:line="254" w:lineRule="auto"/>
             </w:pPr>
             <w:r>
+              <w:rPr>
+                <w:rFonts w:ascii="Arial" w:hAnsi="Arial"/>
+                <w:b/>
+                <w:color w:val="000000"/>
+                <w:sz w:val="19"/>
+              </w:rPr>
               <w:t xml:space="preserve">Relationship</w:t>
             </w:r>
           </w:p>
         </w:tc>
         <w:tc>
-          <w:tcPr/>
+          <w:tcPr>
+            <w:vAlign w:val="center"/>
+            <w:shd w:fill="EAF0FC"/>
+          </w:tcPr>
           <w:p>
             <w:pPr>
               <w:pStyle w:val="Compact"/>
-              <w:jc w:val="left"/>
+              <w:spacing w:after="60" w:line="254" w:lineRule="auto"/>
             </w:pPr>
             <w:r>
+              <w:rPr>
+                <w:rFonts w:ascii="Arial" w:hAnsi="Arial"/>
+                <w:b/>
+                <w:color w:val="000000"/>
+                <w:sz w:val="19"/>
+              </w:rPr>
               <w:t xml:space="preserve">Cardinality</w:t>
             </w:r>
           </w:p>
         </w:tc>
         <w:tc>
-          <w:tcPr/>
+          <w:tcPr>
+            <w:vAlign w:val="center"/>
+            <w:shd w:fill="EAF0FC"/>
+          </w:tcPr>
           <w:p>
             <w:pPr>
               <w:pStyle w:val="Compact"/>
-              <w:jc w:val="left"/>
+              <w:spacing w:after="60" w:line="254" w:lineRule="auto"/>
             </w:pPr>
             <w:r>
+              <w:rPr>
+                <w:rFonts w:ascii="Arial" w:hAnsi="Arial"/>
+                <w:b/>
+                <w:color w:val="000000"/>
+                <w:sz w:val="19"/>
+              </w:rPr>
               <w:t xml:space="preserve">Implementation and participation</w:t>
             </w:r>
           </w:p>
         </w:tc>
       </w:tr>
       <w:tr>
+        <w:trPr>
+          <w:cantSplit/>
+        </w:trPr>
         <w:tc>
-          <w:tcPr/>
+          <w:tcPr>
+            <w:vAlign w:val="center"/>
+            <w:shd w:fill="FFFFFF"/>
+          </w:tcPr>
           <w:p>
             <w:pPr>
               <w:pStyle w:val="Compact"/>
-              <w:jc w:val="left"/>
+              <w:spacing w:after="60" w:line="254" w:lineRule="auto"/>
             </w:pPr>
             <w:r>
+              <w:rPr>
+                <w:rFonts w:ascii="Arial" w:hAnsi="Arial"/>
+                <w:color w:val="000000"/>
+                <w:sz w:val="19"/>
+              </w:rPr>
               <w:t xml:space="preserve">Bank → BankAccount</w:t>
             </w:r>
           </w:p>
         </w:tc>
         <w:tc>
-          <w:tcPr/>
+          <w:tcPr>
+            <w:vAlign w:val="center"/>
+            <w:shd w:fill="FFFFFF"/>
+          </w:tcPr>
           <w:p>
             <w:pPr>
               <w:pStyle w:val="Compact"/>
-              <w:jc w:val="left"/>
+              <w:spacing w:after="60" w:line="254" w:lineRule="auto"/>
             </w:pPr>
             <w:r>
+              <w:rPr>
+                <w:rFonts w:ascii="Arial" w:hAnsi="Arial"/>
+                <w:color w:val="000000"/>
+                <w:sz w:val="19"/>
+              </w:rPr>
               <w:t xml:space="preserve">1 : 0..N</w:t>
             </w:r>
           </w:p>
         </w:tc>
         <w:tc>
-          <w:tcPr/>
+          <w:tcPr>
+            <w:vAlign w:val="center"/>
+            <w:shd w:fill="FFFFFF"/>
+          </w:tcPr>
           <w:p>
             <w:pPr>
               <w:pStyle w:val="Compact"/>
-              <w:jc w:val="left"/>
+              <w:spacing w:after="60" w:line="254" w:lineRule="auto"/>
             </w:pPr>
             <w:r>
+              <w:rPr>
+                <w:rFonts w:ascii="Arial" w:hAnsi="Arial"/>
+                <w:color w:val="000000"/>
+                <w:sz w:val="19"/>
+              </w:rPr>
               <w:t xml:space="preserve">Each account has exactly one non-null bank FK. A bank can have no accounts.</w:t>
             </w:r>
           </w:p>
         </w:tc>
       </w:tr>
       <w:tr>
+        <w:trPr>
+          <w:cantSplit/>
+        </w:trPr>
         <w:tc>
-          <w:tcPr/>
+          <w:tcPr>
+            <w:vAlign w:val="center"/>
+            <w:shd w:fill="F7F9FC"/>
+          </w:tcPr>
           <w:p>
             <w:pPr>
               <w:pStyle w:val="Compact"/>
-              <w:jc w:val="left"/>
+              <w:spacing w:after="60" w:line="254" w:lineRule="auto"/>
             </w:pPr>
             <w:r>
+              <w:rPr>
+                <w:rFonts w:ascii="Arial" w:hAnsi="Arial"/>
+                <w:color w:val="000000"/>
+                <w:sz w:val="19"/>
+              </w:rPr>
               <w:t xml:space="preserve">User ↔ BankAccount</w:t>
             </w:r>
           </w:p>
         </w:tc>
         <w:tc>
-          <w:tcPr/>
+          <w:tcPr>
+            <w:vAlign w:val="center"/>
+            <w:shd w:fill="F7F9FC"/>
+          </w:tcPr>
           <w:p>
             <w:pPr>
               <w:pStyle w:val="Compact"/>
-              <w:jc w:val="left"/>
+              <w:spacing w:after="60" w:line="254" w:lineRule="auto"/>
             </w:pPr>
             <w:r>
+              <w:rPr>
+                <w:rFonts w:ascii="Arial" w:hAnsi="Arial"/>
+                <w:color w:val="000000"/>
+                <w:sz w:val="19"/>
+              </w:rPr>
               <w:t xml:space="preserve">M : N</w:t>
             </w:r>
           </w:p>
         </w:tc>
         <w:tc>
-          <w:tcPr/>
+          <w:tcPr>
+            <w:vAlign w:val="center"/>
+            <w:shd w:fill="F7F9FC"/>
+          </w:tcPr>
           <w:p>
             <w:pPr>
               <w:pStyle w:val="Compact"/>
-              <w:jc w:val="left"/>
+              <w:spacing w:after="60" w:line="254" w:lineRule="auto"/>
             </w:pPr>
             <w:r>
               <w:rPr>
                 <w:rStyle w:val="VerbatimChar"/>
+                <w:rFonts w:ascii="Arial" w:hAnsi="Arial"/>
+                <w:color w:val="000000"/>
+                <w:sz w:val="19"/>
               </w:rPr>
               <w:t xml:space="preserve">account_holders(user_id, account_id)</w:t>
             </w:r>
             <w:r>
+              <w:rPr>
+                <w:rFonts w:ascii="Arial" w:hAnsi="Arial"/>
+                <w:color w:val="000000"/>
+                <w:sz w:val="19"/>
+              </w:rPr>
               <w:t xml:space="preserve">, with a composite PK and two FKs. A user may initially own zero accounts.</w:t>
             </w:r>
           </w:p>
         </w:tc>
       </w:tr>
       <w:tr>
+        <w:trPr>
+          <w:cantSplit/>
+        </w:trPr>
         <w:tc>
-          <w:tcPr/>
+          <w:tcPr>
+            <w:vAlign w:val="center"/>
+            <w:shd w:fill="FFFFFF"/>
+          </w:tcPr>
           <w:p>
             <w:pPr>
               <w:pStyle w:val="Compact"/>
-              <w:jc w:val="left"/>
+              <w:spacing w:after="60" w:line="254" w:lineRule="auto"/>
             </w:pPr>
             <w:r>
+              <w:rPr>
+                <w:rFonts w:ascii="Arial" w:hAnsi="Arial"/>
+                <w:color w:val="000000"/>
+                <w:sz w:val="19"/>
+              </w:rPr>
               <w:t xml:space="preserve">BankAccount → AccountHolder</w:t>
             </w:r>
           </w:p>
         </w:tc>
         <w:tc>
-          <w:tcPr/>
+          <w:tcPr>
+            <w:vAlign w:val="center"/>
+            <w:shd w:fill="FFFFFF"/>
+          </w:tcPr>
           <w:p>
             <w:pPr>
               <w:pStyle w:val="Compact"/>
-              <w:jc w:val="left"/>
+              <w:spacing w:after="60" w:line="254" w:lineRule="auto"/>
             </w:pPr>
             <w:r>
+              <w:rPr>
+                <w:rFonts w:ascii="Arial" w:hAnsi="Arial"/>
+                <w:color w:val="000000"/>
+                <w:sz w:val="19"/>
+              </w:rPr>
               <w:t xml:space="preserve">1 : 1..N intended</w:t>
             </w:r>
           </w:p>
         </w:tc>
         <w:tc>
-          <w:tcPr/>
+          <w:tcPr>
+            <w:vAlign w:val="center"/>
+            <w:shd w:fill="FFFFFF"/>
+          </w:tcPr>
           <w:p>
             <w:pPr>
               <w:pStyle w:val="Compact"/>
-              <w:jc w:val="left"/>
+              <w:spacing w:after="60" w:line="254" w:lineRule="auto"/>
             </w:pPr>
             <w:r>
+              <w:rPr>
+                <w:rFonts w:ascii="Arial" w:hAnsi="Arial"/>
+                <w:color w:val="000000"/>
+                <w:sz w:val="19"/>
+              </w:rPr>
               <w:t xml:space="preserve">The account-opening function inserts account and first holder atomically. SQL FKs alone do</w:t>
             </w:r>
             <w:r>
+              <w:rPr>
+                <w:rFonts w:ascii="Arial" w:hAnsi="Arial"/>
+                <w:color w:val="000000"/>
+                <w:sz w:val="19"/>
+              </w:rPr>
               <w:t xml:space="preserve"> </w:t>
             </w:r>
             <w:r>
               <w:rPr>
+                <w:rFonts w:ascii="Arial" w:hAnsi="Arial"/>
                 <w:b/>
                 <w:bCs/>
+                <w:color w:val="000000"/>
+                <w:sz w:val="19"/>
               </w:rPr>
               <w:t xml:space="preserve">not</w:t>
             </w:r>
             <w:r>
+              <w:rPr>
+                <w:rFonts w:ascii="Arial" w:hAnsi="Arial"/>
+                <w:color w:val="000000"/>
+                <w:sz w:val="19"/>
+              </w:rPr>
               <w:t xml:space="preserve"> </w:t>
             </w:r>
             <w:r>
+              <w:rPr>
+                <w:rFonts w:ascii="Arial" w:hAnsi="Arial"/>
+                <w:color w:val="000000"/>
+                <w:sz w:val="19"/>
+              </w:rPr>
               <w:t xml:space="preserve">enforce an account having at least one holder; administrative SQL can violate that minimum.</w:t>
             </w:r>
           </w:p>
         </w:tc>
       </w:tr>
       <w:tr>
+        <w:trPr>
+          <w:cantSplit/>
+        </w:trPr>
         <w:tc>
-          <w:tcPr/>
+          <w:tcPr>
+            <w:vAlign w:val="center"/>
+            <w:shd w:fill="F7F9FC"/>
+          </w:tcPr>
           <w:p>
             <w:pPr>
               <w:pStyle w:val="Compact"/>
-              <w:jc w:val="left"/>
+              <w:spacing w:after="60" w:line="254" w:lineRule="auto"/>
             </w:pPr>
             <w:r>
+              <w:rPr>
+                <w:rFonts w:ascii="Arial" w:hAnsi="Arial"/>
+                <w:color w:val="000000"/>
+                <w:sz w:val="19"/>
+              </w:rPr>
               <w:t xml:space="preserve">User → Transfer</w:t>
             </w:r>
           </w:p>
         </w:tc>
         <w:tc>
-          <w:tcPr/>
+          <w:tcPr>
+            <w:vAlign w:val="center"/>
+            <w:shd w:fill="F7F9FC"/>
+          </w:tcPr>
           <w:p>
             <w:pPr>
               <w:pStyle w:val="Compact"/>
-              <w:jc w:val="left"/>
+              <w:spacing w:after="60" w:line="254" w:lineRule="auto"/>
             </w:pPr>
             <w:r>
+              <w:rPr>
+                <w:rFonts w:ascii="Arial" w:hAnsi="Arial"/>
+                <w:color w:val="000000"/>
+                <w:sz w:val="19"/>
+              </w:rPr>
               <w:t xml:space="preserve">1 : 0..N</w:t>
             </w:r>
           </w:p>
         </w:tc>
         <w:tc>
-          <w:tcPr/>
+          <w:tcPr>
+            <w:vAlign w:val="center"/>
+            <w:shd w:fill="F7F9FC"/>
+          </w:tcPr>
           <w:p>
             <w:pPr>
               <w:pStyle w:val="Compact"/>
-              <w:jc w:val="left"/>
+              <w:spacing w:after="60" w:line="254" w:lineRule="auto"/>
             </w:pPr>
             <w:r>
+              <w:rPr>
+                <w:rFonts w:ascii="Arial" w:hAnsi="Arial"/>
+                <w:color w:val="000000"/>
+                <w:sz w:val="19"/>
+              </w:rPr>
               <w:t xml:space="preserve">One non-null</w:t>
             </w:r>
             <w:r>
+              <w:rPr>
+                <w:rFonts w:ascii="Arial" w:hAnsi="Arial"/>
+                <w:color w:val="000000"/>
+                <w:sz w:val="19"/>
+              </w:rPr>
               <w:t xml:space="preserve"> </w:t>
             </w:r>
             <w:r>
               <w:rPr>
                 <w:rStyle w:val="VerbatimChar"/>
+                <w:rFonts w:ascii="Arial" w:hAnsi="Arial"/>
+                <w:color w:val="000000"/>
+                <w:sz w:val="19"/>
               </w:rPr>
               <w:t xml:space="preserve">initiated_by</w:t>
             </w:r>
             <w:r>
+              <w:rPr>
+                <w:rFonts w:ascii="Arial" w:hAnsi="Arial"/>
+                <w:color w:val="000000"/>
+                <w:sz w:val="19"/>
+              </w:rPr>
               <w:t xml:space="preserve"> </w:t>
             </w:r>
             <w:r>
+              <w:rPr>
+                <w:rFonts w:ascii="Arial" w:hAnsi="Arial"/>
+                <w:color w:val="000000"/>
+                <w:sz w:val="19"/>
+              </w:rPr>
               <w:t xml:space="preserve">FK per transfer; not a duplicate of account ownership.</w:t>
             </w:r>
           </w:p>
         </w:tc>
       </w:tr>
       <w:tr>
+        <w:trPr>
+          <w:cantSplit/>
+        </w:trPr>
         <w:tc>
-          <w:tcPr/>
+          <w:tcPr>
+            <w:vAlign w:val="center"/>
+            <w:shd w:fill="FFFFFF"/>
+          </w:tcPr>
           <w:p>
             <w:pPr>
               <w:pStyle w:val="Compact"/>
-              <w:jc w:val="left"/>
+              <w:spacing w:after="60" w:line="254" w:lineRule="auto"/>
             </w:pPr>
             <w:r>
+              <w:rPr>
+                <w:rFonts w:ascii="Arial" w:hAnsi="Arial"/>
+                <w:color w:val="000000"/>
+                <w:sz w:val="19"/>
+              </w:rPr>
               <w:t xml:space="preserve">BankAccount → Transfer (source)</w:t>
             </w:r>
           </w:p>
         </w:tc>
         <w:tc>
-          <w:tcPr/>
+          <w:tcPr>
+            <w:vAlign w:val="center"/>
+            <w:shd w:fill="FFFFFF"/>
+          </w:tcPr>
           <w:p>
             <w:pPr>
               <w:pStyle w:val="Compact"/>
-              <w:jc w:val="left"/>
+              <w:spacing w:after="60" w:line="254" w:lineRule="auto"/>
             </w:pPr>
             <w:r>
+              <w:rPr>
+                <w:rFonts w:ascii="Arial" w:hAnsi="Arial"/>
+                <w:color w:val="000000"/>
+                <w:sz w:val="19"/>
+              </w:rPr>
               <w:t xml:space="preserve">1 : 0..N</w:t>
             </w:r>
           </w:p>
         </w:tc>
         <w:tc>
-          <w:tcPr/>
+          <w:tcPr>
+            <w:vAlign w:val="center"/>
+            <w:shd w:fill="FFFFFF"/>
+          </w:tcPr>
           <w:p>
             <w:pPr>
               <w:pStyle w:val="Compact"/>
-              <w:jc w:val="left"/>
+              <w:spacing w:after="60" w:line="254" w:lineRule="auto"/>
             </w:pPr>
             <w:r>
+              <w:rPr>
+                <w:rFonts w:ascii="Arial" w:hAnsi="Arial"/>
+                <w:color w:val="000000"/>
+                <w:sz w:val="19"/>
+              </w:rPr>
               <w:t xml:space="preserve">One non-null source FK.</w:t>
             </w:r>
           </w:p>
         </w:tc>
       </w:tr>
       <w:tr>
+        <w:trPr>
+          <w:cantSplit/>
+        </w:trPr>
         <w:tc>
-          <w:tcPr/>
+          <w:tcPr>
+            <w:vAlign w:val="center"/>
+            <w:shd w:fill="F7F9FC"/>
+          </w:tcPr>
           <w:p>
             <w:pPr>
               <w:pStyle w:val="Compact"/>
-              <w:jc w:val="left"/>
+              <w:spacing w:after="60" w:line="254" w:lineRule="auto"/>
             </w:pPr>
             <w:r>
+              <w:rPr>
+                <w:rFonts w:ascii="Arial" w:hAnsi="Arial"/>
+                <w:color w:val="000000"/>
+                <w:sz w:val="19"/>
+              </w:rPr>
               <w:t xml:space="preserve">BankAccount → Transfer (destination)</w:t>
             </w:r>
           </w:p>
         </w:tc>
         <w:tc>
-          <w:tcPr/>
+          <w:tcPr>
+            <w:vAlign w:val="center"/>
+            <w:shd w:fill="F7F9FC"/>
+          </w:tcPr>
           <w:p>
             <w:pPr>
               <w:pStyle w:val="Compact"/>
-              <w:jc w:val="left"/>
+              <w:spacing w:after="60" w:line="254" w:lineRule="auto"/>
             </w:pPr>
             <w:r>
+              <w:rPr>
+                <w:rFonts w:ascii="Arial" w:hAnsi="Arial"/>
+                <w:color w:val="000000"/>
+                <w:sz w:val="19"/>
+              </w:rPr>
               <w:t xml:space="preserve">1 : 0..N</w:t>
             </w:r>
           </w:p>
         </w:tc>
         <w:tc>
-          <w:tcPr/>
+          <w:tcPr>
+            <w:vAlign w:val="center"/>
+            <w:shd w:fill="F7F9FC"/>
+          </w:tcPr>
           <w:p>
             <w:pPr>
               <w:pStyle w:val="Compact"/>
-              <w:jc w:val="left"/>
+              <w:spacing w:after="60" w:line="254" w:lineRule="auto"/>
             </w:pPr>
             <w:r>
+              <w:rPr>
+                <w:rFonts w:ascii="Arial" w:hAnsi="Arial"/>
+                <w:color w:val="000000"/>
+                <w:sz w:val="19"/>
+              </w:rPr>
               <w:t xml:space="preserve">One non-null destination FK; source must differ.</w:t>
             </w:r>
           </w:p>
@@ -507,7 +767,8 @@
     </w:tbl>
     <w:p>
       <w:pPr>
-        <w:pStyle w:val="BodyText"/>
+        <w:pStyle w:val="FirstParagraph"/>
+        <w:widowControl/>
       </w:pPr>
       <w:r>
         <w:t xml:space="preserve">No redundant direct</w:t>
@@ -540,23 +801,40 @@
         <w:t xml:space="preserve">. A joint account therefore remains one account with one balance. Summing after an owner join can multiply its balance; account-scoped queries deduplicate by account ID.</w:t>
       </w:r>
     </w:p>
-    <w:bookmarkEnd w:id="21"/>
-    <w:bookmarkStart w:id="22" w:name="data-dictionary"/>
     <w:p>
       <w:pPr>
         <w:pStyle w:val="Heading2"/>
-      </w:pPr>
-      <w:r>
+        <w:widowControl/>
+      </w:pPr>
+      <w:bookmarkStart w:id="12" w:name="_1c081cf0870ba5f68358457b9d5c453ceee60cc"/>
+      <w:r>
+        <w:rPr>
+          <w:color w:val="000000"/>
+        </w:rPr>
         <w:t xml:space="preserve">Data dictionary</w:t>
       </w:r>
+      <w:bookmarkEnd w:id="12"/>
     </w:p>
     <w:tbl>
       <w:tblPr>
         <w:tblStyle w:val="Table"/>
         <w:tblW w:type="pct" w:w="5000"/>
-        <w:jc w:val="left"/>
         <w:tblLayout w:type="fixed"/>
         <w:tblLook w:firstRow="1" w:lastRow="0" w:firstColumn="0" w:lastColumn="0" w:noHBand="0" w:noVBand="0" w:val="0020"/>
+        <w:tblBorders>
+          <w:top w:val="single" w:sz="4" w:color="D9D9D9"/>
+          <w:left w:val="single" w:sz="4" w:color="D9D9D9"/>
+          <w:bottom w:val="single" w:sz="4" w:color="D9D9D9"/>
+          <w:right w:val="single" w:sz="4" w:color="D9D9D9"/>
+          <w:insideH w:val="single" w:sz="4" w:color="D9D9D9"/>
+          <w:insideV w:val="single" w:sz="4" w:color="D9D9D9"/>
+        </w:tblBorders>
+        <w:tblCellMar>
+          <w:top w:w="90" w:type="dxa"/>
+          <w:left w:w="90" w:type="dxa"/>
+          <w:bottom w:w="90" w:type="dxa"/>
+          <w:right w:w="90" w:type="dxa"/>
+        </w:tblCellMar>
       </w:tblPr>
       <w:tblGrid>
         <w:gridCol w:w="2640"/>
@@ -566,364 +844,641 @@
       <w:tr>
         <w:trPr>
           <w:tblHeader w:val="on"/>
+          <w:cantSplit/>
+          <w:tblHeader/>
         </w:trPr>
         <w:tc>
-          <w:tcPr/>
+          <w:tcPr>
+            <w:vAlign w:val="center"/>
+            <w:shd w:fill="EAF0FC"/>
+          </w:tcPr>
           <w:p>
             <w:pPr>
               <w:pStyle w:val="Compact"/>
-              <w:jc w:val="left"/>
+              <w:spacing w:after="60" w:line="254" w:lineRule="auto"/>
             </w:pPr>
             <w:r>
+              <w:rPr>
+                <w:rFonts w:ascii="Arial" w:hAnsi="Arial"/>
+                <w:b/>
+                <w:color w:val="000000"/>
+                <w:sz w:val="19"/>
+              </w:rPr>
               <w:t xml:space="preserve">Relation</w:t>
             </w:r>
           </w:p>
         </w:tc>
         <w:tc>
-          <w:tcPr/>
+          <w:tcPr>
+            <w:vAlign w:val="center"/>
+            <w:shd w:fill="EAF0FC"/>
+          </w:tcPr>
           <w:p>
             <w:pPr>
               <w:pStyle w:val="Compact"/>
-              <w:jc w:val="left"/>
+              <w:spacing w:after="60" w:line="254" w:lineRule="auto"/>
             </w:pPr>
             <w:r>
+              <w:rPr>
+                <w:rFonts w:ascii="Arial" w:hAnsi="Arial"/>
+                <w:b/>
+                <w:color w:val="000000"/>
+                <w:sz w:val="19"/>
+              </w:rPr>
               <w:t xml:space="preserve">Keys</w:t>
             </w:r>
           </w:p>
         </w:tc>
         <w:tc>
-          <w:tcPr/>
+          <w:tcPr>
+            <w:vAlign w:val="center"/>
+            <w:shd w:fill="EAF0FC"/>
+          </w:tcPr>
           <w:p>
             <w:pPr>
               <w:pStyle w:val="Compact"/>
-              <w:jc w:val="left"/>
+              <w:spacing w:after="60" w:line="254" w:lineRule="auto"/>
             </w:pPr>
             <w:r>
+              <w:rPr>
+                <w:rFonts w:ascii="Arial" w:hAnsi="Arial"/>
+                <w:b/>
+                <w:color w:val="000000"/>
+                <w:sz w:val="19"/>
+              </w:rPr>
               <w:t xml:space="preserve">Non-key attributes and domains</w:t>
             </w:r>
           </w:p>
         </w:tc>
       </w:tr>
       <w:tr>
+        <w:trPr>
+          <w:cantSplit/>
+        </w:trPr>
         <w:tc>
-          <w:tcPr/>
+          <w:tcPr>
+            <w:vAlign w:val="center"/>
+            <w:shd w:fill="FFFFFF"/>
+          </w:tcPr>
           <w:p>
             <w:pPr>
               <w:pStyle w:val="Compact"/>
-              <w:jc w:val="left"/>
+              <w:spacing w:after="60" w:line="254" w:lineRule="auto"/>
             </w:pPr>
             <w:r>
               <w:rPr>
                 <w:rStyle w:val="VerbatimChar"/>
+                <w:rFonts w:ascii="Arial" w:hAnsi="Arial"/>
+                <w:color w:val="000000"/>
+                <w:sz w:val="19"/>
               </w:rPr>
               <w:t xml:space="preserve">users</w:t>
             </w:r>
           </w:p>
         </w:tc>
         <w:tc>
-          <w:tcPr/>
+          <w:tcPr>
+            <w:vAlign w:val="center"/>
+            <w:shd w:fill="FFFFFF"/>
+          </w:tcPr>
           <w:p>
             <w:pPr>
               <w:pStyle w:val="Compact"/>
-              <w:jc w:val="left"/>
+              <w:spacing w:after="60" w:line="254" w:lineRule="auto"/>
             </w:pPr>
             <w:r>
+              <w:rPr>
+                <w:rFonts w:ascii="Arial" w:hAnsi="Arial"/>
+                <w:color w:val="000000"/>
+                <w:sz w:val="19"/>
+              </w:rPr>
               <w:t xml:space="preserve">PK</w:t>
             </w:r>
             <w:r>
+              <w:rPr>
+                <w:rFonts w:ascii="Arial" w:hAnsi="Arial"/>
+                <w:color w:val="000000"/>
+                <w:sz w:val="19"/>
+              </w:rPr>
               <w:t xml:space="preserve"> </w:t>
             </w:r>
             <w:r>
               <w:rPr>
                 <w:rStyle w:val="VerbatimChar"/>
+                <w:rFonts w:ascii="Arial" w:hAnsi="Arial"/>
+                <w:color w:val="000000"/>
+                <w:sz w:val="19"/>
               </w:rPr>
               <w:t xml:space="preserve">id</w:t>
             </w:r>
             <w:r>
+              <w:rPr>
+                <w:rFonts w:ascii="Arial" w:hAnsi="Arial"/>
+                <w:color w:val="000000"/>
+                <w:sz w:val="19"/>
+              </w:rPr>
               <w:t xml:space="preserve">; alternate keys</w:t>
             </w:r>
             <w:r>
+              <w:rPr>
+                <w:rFonts w:ascii="Arial" w:hAnsi="Arial"/>
+                <w:color w:val="000000"/>
+                <w:sz w:val="19"/>
+              </w:rPr>
               <w:t xml:space="preserve"> </w:t>
             </w:r>
             <w:r>
               <w:rPr>
                 <w:rStyle w:val="VerbatimChar"/>
+                <w:rFonts w:ascii="Arial" w:hAnsi="Arial"/>
+                <w:color w:val="000000"/>
+                <w:sz w:val="19"/>
               </w:rPr>
               <w:t xml:space="preserve">username</w:t>
             </w:r>
             <w:r>
+              <w:rPr>
+                <w:rFonts w:ascii="Arial" w:hAnsi="Arial"/>
+                <w:color w:val="000000"/>
+                <w:sz w:val="19"/>
+              </w:rPr>
               <w:t xml:space="preserve">,</w:t>
             </w:r>
             <w:r>
+              <w:rPr>
+                <w:rFonts w:ascii="Arial" w:hAnsi="Arial"/>
+                <w:color w:val="000000"/>
+                <w:sz w:val="19"/>
+              </w:rPr>
               <w:t xml:space="preserve"> </w:t>
             </w:r>
             <w:r>
               <w:rPr>
                 <w:rStyle w:val="VerbatimChar"/>
+                <w:rFonts w:ascii="Arial" w:hAnsi="Arial"/>
+                <w:color w:val="000000"/>
+                <w:sz w:val="19"/>
               </w:rPr>
               <w:t xml:space="preserve">email</w:t>
             </w:r>
           </w:p>
         </w:tc>
         <w:tc>
-          <w:tcPr/>
+          <w:tcPr>
+            <w:vAlign w:val="center"/>
+            <w:shd w:fill="FFFFFF"/>
+          </w:tcPr>
           <w:p>
             <w:pPr>
               <w:pStyle w:val="Compact"/>
-              <w:jc w:val="left"/>
+              <w:spacing w:after="60" w:line="254" w:lineRule="auto"/>
             </w:pPr>
             <w:r>
+              <w:rPr>
+                <w:rFonts w:ascii="Arial" w:hAnsi="Arial"/>
+                <w:color w:val="000000"/>
+                <w:sz w:val="19"/>
+              </w:rPr>
               <w:t xml:space="preserve">UUID id; lowercase username</w:t>
             </w:r>
             <w:r>
+              <w:rPr>
+                <w:rFonts w:ascii="Arial" w:hAnsi="Arial"/>
+                <w:color w:val="000000"/>
+                <w:sz w:val="19"/>
+              </w:rPr>
               <w:t xml:space="preserve"> </w:t>
             </w:r>
             <w:r>
               <w:rPr>
                 <w:rStyle w:val="VerbatimChar"/>
+                <w:rFonts w:ascii="Arial" w:hAnsi="Arial"/>
+                <w:color w:val="000000"/>
+                <w:sz w:val="19"/>
               </w:rPr>
               <w:t xml:space="preserve">[a-z][a-z0-9_]{2,29}</w:t>
             </w:r>
             <w:r>
+              <w:rPr>
+                <w:rFonts w:ascii="Arial" w:hAnsi="Arial"/>
+                <w:color w:val="000000"/>
+                <w:sz w:val="19"/>
+              </w:rPr>
               <w:t xml:space="preserve">; lowercase unique email; nullable unique E.164-style phone; full_name 1–80 chars; Argon2id password_hash; created_at timestamptz.</w:t>
             </w:r>
           </w:p>
         </w:tc>
       </w:tr>
       <w:tr>
+        <w:trPr>
+          <w:cantSplit/>
+        </w:trPr>
         <w:tc>
-          <w:tcPr/>
+          <w:tcPr>
+            <w:vAlign w:val="center"/>
+            <w:shd w:fill="F7F9FC"/>
+          </w:tcPr>
           <w:p>
             <w:pPr>
               <w:pStyle w:val="Compact"/>
-              <w:jc w:val="left"/>
+              <w:spacing w:after="60" w:line="254" w:lineRule="auto"/>
             </w:pPr>
             <w:r>
               <w:rPr>
                 <w:rStyle w:val="VerbatimChar"/>
+                <w:rFonts w:ascii="Arial" w:hAnsi="Arial"/>
+                <w:color w:val="000000"/>
+                <w:sz w:val="19"/>
               </w:rPr>
               <w:t xml:space="preserve">banks</w:t>
             </w:r>
           </w:p>
         </w:tc>
         <w:tc>
-          <w:tcPr/>
+          <w:tcPr>
+            <w:vAlign w:val="center"/>
+            <w:shd w:fill="F7F9FC"/>
+          </w:tcPr>
           <w:p>
             <w:pPr>
               <w:pStyle w:val="Compact"/>
-              <w:jc w:val="left"/>
+              <w:spacing w:after="60" w:line="254" w:lineRule="auto"/>
             </w:pPr>
             <w:r>
+              <w:rPr>
+                <w:rFonts w:ascii="Arial" w:hAnsi="Arial"/>
+                <w:color w:val="000000"/>
+                <w:sz w:val="19"/>
+              </w:rPr>
               <w:t xml:space="preserve">PK</w:t>
             </w:r>
             <w:r>
+              <w:rPr>
+                <w:rFonts w:ascii="Arial" w:hAnsi="Arial"/>
+                <w:color w:val="000000"/>
+                <w:sz w:val="19"/>
+              </w:rPr>
               <w:t xml:space="preserve"> </w:t>
             </w:r>
             <w:r>
               <w:rPr>
                 <w:rStyle w:val="VerbatimChar"/>
+                <w:rFonts w:ascii="Arial" w:hAnsi="Arial"/>
+                <w:color w:val="000000"/>
+                <w:sz w:val="19"/>
               </w:rPr>
               <w:t xml:space="preserve">id</w:t>
             </w:r>
             <w:r>
+              <w:rPr>
+                <w:rFonts w:ascii="Arial" w:hAnsi="Arial"/>
+                <w:color w:val="000000"/>
+                <w:sz w:val="19"/>
+              </w:rPr>
               <w:t xml:space="preserve">; alternate key</w:t>
             </w:r>
             <w:r>
+              <w:rPr>
+                <w:rFonts w:ascii="Arial" w:hAnsi="Arial"/>
+                <w:color w:val="000000"/>
+                <w:sz w:val="19"/>
+              </w:rPr>
               <w:t xml:space="preserve"> </w:t>
             </w:r>
             <w:r>
               <w:rPr>
                 <w:rStyle w:val="VerbatimChar"/>
+                <w:rFonts w:ascii="Arial" w:hAnsi="Arial"/>
+                <w:color w:val="000000"/>
+                <w:sz w:val="19"/>
               </w:rPr>
               <w:t xml:space="preserve">routing_number</w:t>
             </w:r>
           </w:p>
         </w:tc>
         <w:tc>
-          <w:tcPr/>
+          <w:tcPr>
+            <w:vAlign w:val="center"/>
+            <w:shd w:fill="F7F9FC"/>
+          </w:tcPr>
           <w:p>
             <w:pPr>
               <w:pStyle w:val="Compact"/>
-              <w:jc w:val="left"/>
+              <w:spacing w:after="60" w:line="254" w:lineRule="auto"/>
             </w:pPr>
             <w:r>
+              <w:rPr>
+                <w:rFonts w:ascii="Arial" w:hAnsi="Arial"/>
+                <w:color w:val="000000"/>
+                <w:sz w:val="19"/>
+              </w:rPr>
               <w:t xml:space="preserve">Nine-digit routing string; name text. A name is not assumed unique.</w:t>
             </w:r>
           </w:p>
         </w:tc>
       </w:tr>
       <w:tr>
+        <w:trPr>
+          <w:cantSplit/>
+        </w:trPr>
         <w:tc>
-          <w:tcPr/>
+          <w:tcPr>
+            <w:vAlign w:val="center"/>
+            <w:shd w:fill="FFFFFF"/>
+          </w:tcPr>
           <w:p>
             <w:pPr>
               <w:pStyle w:val="Compact"/>
-              <w:jc w:val="left"/>
+              <w:spacing w:after="60" w:line="254" w:lineRule="auto"/>
             </w:pPr>
             <w:r>
               <w:rPr>
                 <w:rStyle w:val="VerbatimChar"/>
+                <w:rFonts w:ascii="Arial" w:hAnsi="Arial"/>
+                <w:color w:val="000000"/>
+                <w:sz w:val="19"/>
               </w:rPr>
               <w:t xml:space="preserve">bank_accounts</w:t>
             </w:r>
           </w:p>
         </w:tc>
         <w:tc>
-          <w:tcPr/>
+          <w:tcPr>
+            <w:vAlign w:val="center"/>
+            <w:shd w:fill="FFFFFF"/>
+          </w:tcPr>
           <w:p>
             <w:pPr>
               <w:pStyle w:val="Compact"/>
-              <w:jc w:val="left"/>
+              <w:spacing w:after="60" w:line="254" w:lineRule="auto"/>
             </w:pPr>
             <w:r>
+              <w:rPr>
+                <w:rFonts w:ascii="Arial" w:hAnsi="Arial"/>
+                <w:color w:val="000000"/>
+                <w:sz w:val="19"/>
+              </w:rPr>
               <w:t xml:space="preserve">PK</w:t>
             </w:r>
             <w:r>
+              <w:rPr>
+                <w:rFonts w:ascii="Arial" w:hAnsi="Arial"/>
+                <w:color w:val="000000"/>
+                <w:sz w:val="19"/>
+              </w:rPr>
               <w:t xml:space="preserve"> </w:t>
             </w:r>
             <w:r>
               <w:rPr>
                 <w:rStyle w:val="VerbatimChar"/>
+                <w:rFonts w:ascii="Arial" w:hAnsi="Arial"/>
+                <w:color w:val="000000"/>
+                <w:sz w:val="19"/>
               </w:rPr>
               <w:t xml:space="preserve">id</w:t>
             </w:r>
             <w:r>
+              <w:rPr>
+                <w:rFonts w:ascii="Arial" w:hAnsi="Arial"/>
+                <w:color w:val="000000"/>
+                <w:sz w:val="19"/>
+              </w:rPr>
               <w:t xml:space="preserve">; alternate key</w:t>
             </w:r>
             <w:r>
+              <w:rPr>
+                <w:rFonts w:ascii="Arial" w:hAnsi="Arial"/>
+                <w:color w:val="000000"/>
+                <w:sz w:val="19"/>
+              </w:rPr>
               <w:t xml:space="preserve"> </w:t>
             </w:r>
             <w:r>
               <w:rPr>
                 <w:rStyle w:val="VerbatimChar"/>
+                <w:rFonts w:ascii="Arial" w:hAnsi="Arial"/>
+                <w:color w:val="000000"/>
+                <w:sz w:val="19"/>
               </w:rPr>
               <w:t xml:space="preserve">(bank_id, account_number)</w:t>
             </w:r>
           </w:p>
         </w:tc>
         <w:tc>
-          <w:tcPr/>
+          <w:tcPr>
+            <w:vAlign w:val="center"/>
+            <w:shd w:fill="FFFFFF"/>
+          </w:tcPr>
           <w:p>
             <w:pPr>
               <w:pStyle w:val="Compact"/>
-              <w:jc w:val="left"/>
+              <w:spacing w:after="60" w:line="254" w:lineRule="auto"/>
             </w:pPr>
             <w:r>
+              <w:rPr>
+                <w:rFonts w:ascii="Arial" w:hAnsi="Arial"/>
+                <w:color w:val="000000"/>
+                <w:sz w:val="19"/>
+              </w:rPr>
               <w:t xml:space="preserve">Non-null bank FK; 12-digit synthetic account number; checking/savings type; shared label 1–60 chars; bigint balance and opening balance in cents, both 0–900,000,000,000,000; active boolean; created_at.</w:t>
             </w:r>
           </w:p>
         </w:tc>
       </w:tr>
       <w:tr>
+        <w:trPr>
+          <w:cantSplit/>
+        </w:trPr>
         <w:tc>
-          <w:tcPr/>
+          <w:tcPr>
+            <w:vAlign w:val="center"/>
+            <w:shd w:fill="F7F9FC"/>
+          </w:tcPr>
           <w:p>
             <w:pPr>
               <w:pStyle w:val="Compact"/>
-              <w:jc w:val="left"/>
+              <w:spacing w:after="60" w:line="254" w:lineRule="auto"/>
             </w:pPr>
             <w:r>
               <w:rPr>
                 <w:rStyle w:val="VerbatimChar"/>
+                <w:rFonts w:ascii="Arial" w:hAnsi="Arial"/>
+                <w:color w:val="000000"/>
+                <w:sz w:val="19"/>
               </w:rPr>
               <w:t xml:space="preserve">account_holders</w:t>
             </w:r>
           </w:p>
         </w:tc>
         <w:tc>
-          <w:tcPr/>
+          <w:tcPr>
+            <w:vAlign w:val="center"/>
+            <w:shd w:fill="F7F9FC"/>
+          </w:tcPr>
           <w:p>
             <w:pPr>
               <w:pStyle w:val="Compact"/>
-              <w:jc w:val="left"/>
+              <w:spacing w:after="60" w:line="254" w:lineRule="auto"/>
             </w:pPr>
             <w:r>
+              <w:rPr>
+                <w:rFonts w:ascii="Arial" w:hAnsi="Arial"/>
+                <w:color w:val="000000"/>
+                <w:sz w:val="19"/>
+              </w:rPr>
               <w:t xml:space="preserve">PK</w:t>
             </w:r>
             <w:r>
+              <w:rPr>
+                <w:rFonts w:ascii="Arial" w:hAnsi="Arial"/>
+                <w:color w:val="000000"/>
+                <w:sz w:val="19"/>
+              </w:rPr>
               <w:t xml:space="preserve"> </w:t>
             </w:r>
             <w:r>
               <w:rPr>
                 <w:rStyle w:val="VerbatimChar"/>
+                <w:rFonts w:ascii="Arial" w:hAnsi="Arial"/>
+                <w:color w:val="000000"/>
+                <w:sz w:val="19"/>
               </w:rPr>
               <w:t xml:space="preserve">(user_id, account_id)</w:t>
             </w:r>
             <w:r>
+              <w:rPr>
+                <w:rFonts w:ascii="Arial" w:hAnsi="Arial"/>
+                <w:color w:val="000000"/>
+                <w:sz w:val="19"/>
+              </w:rPr>
               <w:t xml:space="preserve">; both FKs</w:t>
             </w:r>
           </w:p>
         </w:tc>
         <w:tc>
-          <w:tcPr/>
+          <w:tcPr>
+            <w:vAlign w:val="center"/>
+            <w:shd w:fill="F7F9FC"/>
+          </w:tcPr>
           <w:p>
             <w:pPr>
               <w:pStyle w:val="Compact"/>
-              <w:jc w:val="left"/>
+              <w:spacing w:after="60" w:line="254" w:lineRule="auto"/>
             </w:pPr>
             <w:r>
+              <w:rPr>
+                <w:rFonts w:ascii="Arial" w:hAnsi="Arial"/>
+                <w:color w:val="000000"/>
+                <w:sz w:val="19"/>
+              </w:rPr>
               <w:t xml:space="preserve">joined_at depends on the complete ownership pair. No redundant user name, bank name, or balance.</w:t>
             </w:r>
           </w:p>
         </w:tc>
       </w:tr>
       <w:tr>
+        <w:trPr>
+          <w:cantSplit/>
+        </w:trPr>
         <w:tc>
-          <w:tcPr/>
+          <w:tcPr>
+            <w:vAlign w:val="center"/>
+            <w:shd w:fill="FFFFFF"/>
+          </w:tcPr>
           <w:p>
             <w:pPr>
               <w:pStyle w:val="Compact"/>
-              <w:jc w:val="left"/>
+              <w:spacing w:after="60" w:line="254" w:lineRule="auto"/>
             </w:pPr>
             <w:r>
               <w:rPr>
                 <w:rStyle w:val="VerbatimChar"/>
+                <w:rFonts w:ascii="Arial" w:hAnsi="Arial"/>
+                <w:color w:val="000000"/>
+                <w:sz w:val="19"/>
               </w:rPr>
               <w:t xml:space="preserve">transfers</w:t>
             </w:r>
           </w:p>
         </w:tc>
         <w:tc>
-          <w:tcPr/>
+          <w:tcPr>
+            <w:vAlign w:val="center"/>
+            <w:shd w:fill="FFFFFF"/>
+          </w:tcPr>
           <w:p>
             <w:pPr>
               <w:pStyle w:val="Compact"/>
-              <w:jc w:val="left"/>
+              <w:spacing w:after="60" w:line="254" w:lineRule="auto"/>
             </w:pPr>
             <w:r>
+              <w:rPr>
+                <w:rFonts w:ascii="Arial" w:hAnsi="Arial"/>
+                <w:color w:val="000000"/>
+                <w:sz w:val="19"/>
+              </w:rPr>
               <w:t xml:space="preserve">PK</w:t>
             </w:r>
             <w:r>
+              <w:rPr>
+                <w:rFonts w:ascii="Arial" w:hAnsi="Arial"/>
+                <w:color w:val="000000"/>
+                <w:sz w:val="19"/>
+              </w:rPr>
               <w:t xml:space="preserve"> </w:t>
             </w:r>
             <w:r>
               <w:rPr>
                 <w:rStyle w:val="VerbatimChar"/>
+                <w:rFonts w:ascii="Arial" w:hAnsi="Arial"/>
+                <w:color w:val="000000"/>
+                <w:sz w:val="19"/>
               </w:rPr>
               <w:t xml:space="preserve">id</w:t>
             </w:r>
             <w:r>
+              <w:rPr>
+                <w:rFonts w:ascii="Arial" w:hAnsi="Arial"/>
+                <w:color w:val="000000"/>
+                <w:sz w:val="19"/>
+              </w:rPr>
               <w:t xml:space="preserve">; alternate key</w:t>
             </w:r>
             <w:r>
+              <w:rPr>
+                <w:rFonts w:ascii="Arial" w:hAnsi="Arial"/>
+                <w:color w:val="000000"/>
+                <w:sz w:val="19"/>
+              </w:rPr>
               <w:t xml:space="preserve"> </w:t>
             </w:r>
             <w:r>
               <w:rPr>
                 <w:rStyle w:val="VerbatimChar"/>
+                <w:rFonts w:ascii="Arial" w:hAnsi="Arial"/>
+                <w:color w:val="000000"/>
+                <w:sz w:val="19"/>
               </w:rPr>
               <w:t xml:space="preserve">(initiated_by, idempotency_key)</w:t>
             </w:r>
           </w:p>
         </w:tc>
         <w:tc>
-          <w:tcPr/>
+          <w:tcPr>
+            <w:vAlign w:val="center"/>
+            <w:shd w:fill="FFFFFF"/>
+          </w:tcPr>
           <w:p>
             <w:pPr>
               <w:pStyle w:val="Compact"/>
-              <w:jc w:val="left"/>
+              <w:spacing w:after="60" w:line="254" w:lineRule="auto"/>
             </w:pPr>
             <w:r>
+              <w:rPr>
+                <w:rFonts w:ascii="Arial" w:hAnsi="Arial"/>
+                <w:color w:val="000000"/>
+                <w:sz w:val="19"/>
+              </w:rPr>
               <w:t xml:space="preserve">Three non-null FKs; integer amount 1–100,000,000 cents; memo ≤140 chars; UUID idempotency key; timestamptz. Source and destination differ.</w:t>
             </w:r>
           </w:p>
@@ -932,7 +1487,8 @@
     </w:tbl>
     <w:p>
       <w:pPr>
-        <w:pStyle w:val="BodyText"/>
+        <w:pStyle w:val="FirstParagraph"/>
+        <w:widowControl/>
       </w:pPr>
       <w:r>
         <w:t xml:space="preserve">Phone is optional. PostgreSQL’s normal UNIQUE semantics permit multiple NULLs, so</w:t>
@@ -954,24 +1510,30 @@
     <w:p>
       <w:pPr>
         <w:pStyle w:val="BodyText"/>
+        <w:widowControl/>
       </w:pPr>
       <w:r>
         <w:t xml:space="preserve">Amounts use integer cents to exclude floating-point rounding. The maximum balance is below JavaScript’s exact-integer limit. All accounts are USD, so no account currency or exchange-rate FD is introduced. Money is formatted only at the presentation boundary.</w:t>
       </w:r>
     </w:p>
-    <w:bookmarkEnd w:id="22"/>
-    <w:bookmarkStart w:id="23" w:name="Xd06b885b0a2a57d5cae0a1930dff218d3eacc00"/>
     <w:p>
       <w:pPr>
         <w:pStyle w:val="Heading2"/>
-      </w:pPr>
-      <w:r>
+        <w:widowControl/>
+      </w:pPr>
+      <w:bookmarkStart w:id="13" w:name="_d06b885b0a2a57d5cae0a1930dff218d3eacc00"/>
+      <w:r>
+        <w:rPr>
+          <w:color w:val="000000"/>
+        </w:rPr>
         <w:t xml:space="preserve">Functional dependencies and candidate keys</w:t>
       </w:r>
+      <w:bookmarkEnd w:id="13"/>
     </w:p>
     <w:p>
       <w:pPr>
         <w:pStyle w:val="FirstParagraph"/>
+        <w:widowControl/>
       </w:pPr>
       <w:r>
         <w:t xml:space="preserve">Use U=user_id, A=account_id, B=bank_id, T=transfer_id, K=idempotency_key.</w:t>
@@ -980,6 +1542,7 @@
     <w:p>
       <w:pPr>
         <w:pStyle w:val="Compact"/>
+        <w:widowControl/>
         <w:numPr>
           <w:ilvl w:val="0"/>
           <w:numId w:val="1001"/>
@@ -1028,6 +1591,7 @@
     <w:p>
       <w:pPr>
         <w:pStyle w:val="Compact"/>
+        <w:widowControl/>
         <w:numPr>
           <w:ilvl w:val="0"/>
           <w:numId w:val="1001"/>
@@ -1064,6 +1628,7 @@
     <w:p>
       <w:pPr>
         <w:pStyle w:val="Compact"/>
+        <w:widowControl/>
         <w:numPr>
           <w:ilvl w:val="0"/>
           <w:numId w:val="1001"/>
@@ -1100,6 +1665,7 @@
     <w:p>
       <w:pPr>
         <w:pStyle w:val="Compact"/>
+        <w:widowControl/>
         <w:numPr>
           <w:ilvl w:val="0"/>
           <w:numId w:val="1001"/>
@@ -1124,6 +1690,7 @@
     <w:p>
       <w:pPr>
         <w:pStyle w:val="Compact"/>
+        <w:widowControl/>
         <w:numPr>
           <w:ilvl w:val="0"/>
           <w:numId w:val="1001"/>
@@ -1160,54 +1727,30 @@
     <w:p>
       <w:pPr>
         <w:pStyle w:val="FirstParagraph"/>
-      </w:pPr>
-      <w:r>
-        <w:t xml:space="preserve">These are the intended dependencies. We do not infer extra FDs from a small seed sample, such as</w:t>
-      </w:r>
-      <w:r>
-        <w:t xml:space="preserve"> </w:t>
-      </w:r>
-      <w:r>
-        <w:t xml:space="preserve">“</w:t>
-      </w:r>
-      <w:r>
-        <w:t xml:space="preserve">bank name determines bank</w:t>
-      </w:r>
-      <w:r>
-        <w:t xml:space="preserve">”</w:t>
-      </w:r>
-      <w:r>
-        <w:t xml:space="preserve"> </w:t>
-      </w:r>
-      <w:r>
-        <w:t xml:space="preserve">or</w:t>
-      </w:r>
-      <w:r>
-        <w:t xml:space="preserve"> </w:t>
-      </w:r>
-      <w:r>
-        <w:t xml:space="preserve">“</w:t>
-      </w:r>
-      <w:r>
-        <w:t xml:space="preserve">one user always uses one bank.</w:t>
-      </w:r>
-      <w:r>
-        <w:t xml:space="preserve">”</w:t>
-      </w:r>
-    </w:p>
-    <w:bookmarkEnd w:id="23"/>
-    <w:bookmarkStart w:id="26" w:name="X4d518f24c9b1bfe6f6a1c8d07154ba3950ae578"/>
+        <w:widowControl/>
+      </w:pPr>
+      <w:r>
+        <w:t xml:space="preserve">These are the intended dependencies. We do not infer extra FDs from a small seed sample, such as “bank name determines bank” or “one user always uses one bank.”</w:t>
+      </w:r>
+    </w:p>
     <w:p>
       <w:pPr>
         <w:pStyle w:val="Heading2"/>
-      </w:pPr>
-      <w:r>
+        <w:widowControl/>
+      </w:pPr>
+      <w:bookmarkStart w:id="14" w:name="_4d518f24c9b1bfe6f6a1c8d07154ba3950ae578"/>
+      <w:r>
+        <w:rPr>
+          <w:color w:val="000000"/>
+        </w:rPr>
         <w:t xml:space="preserve">From an unnormalized ownership record to BCNF</w:t>
       </w:r>
+      <w:bookmarkEnd w:id="14"/>
     </w:p>
     <w:p>
       <w:pPr>
         <w:pStyle w:val="FirstParagraph"/>
+        <w:widowControl/>
       </w:pPr>
       <w:r>
         <w:t xml:space="preserve">Start with a hypothetical ownership record containing user attributes, account attributes, bank attributes, and a repeating collection of owners. Repeating owners violate 1NF. Flattening the collection creates the 1NF relation:</w:t>
@@ -1216,6 +1759,7 @@
     <w:p>
       <w:pPr>
         <w:pStyle w:val="BodyText"/>
+        <w:widowControl/>
       </w:pPr>
       <w:r>
         <w:rPr>
@@ -1227,6 +1771,7 @@
     <w:p>
       <w:pPr>
         <w:pStyle w:val="BodyText"/>
+        <w:widowControl/>
       </w:pPr>
       <w:r>
         <w:t xml:space="preserve">Its key is</w:t>
@@ -1247,6 +1792,7 @@
     <w:p>
       <w:pPr>
         <w:pStyle w:val="BodyText"/>
+        <w:widowControl/>
       </w:pPr>
       <w:r>
         <w:rPr>
@@ -1277,6 +1823,7 @@
     <w:p>
       <w:pPr>
         <w:pStyle w:val="BodyText"/>
+        <w:widowControl/>
       </w:pPr>
       <w:r>
         <w:rPr>
@@ -1295,6 +1842,7 @@
     <w:p>
       <w:pPr>
         <w:pStyle w:val="BodyText"/>
+        <w:widowControl/>
       </w:pPr>
       <w:r>
         <w:rPr>
@@ -1310,18 +1858,24 @@
         <w:t xml:space="preserve">Under the declared FD set, every nontrivial determinant in each final relation is a superkey. The alternate keys are explicit UNIQUE constraints. Thus all five relations satisfy BCNF (and therefore 3NF), under these assumptions. We do not claim 4NF or 5NF without a separate multivalued/join-dependency analysis.</w:t>
       </w:r>
     </w:p>
-    <w:bookmarkStart w:id="24" w:name="lossless-decomposition"/>
     <w:p>
       <w:pPr>
         <w:pStyle w:val="Heading3"/>
-      </w:pPr>
-      <w:r>
+        <w:widowControl/>
+      </w:pPr>
+      <w:bookmarkStart w:id="15" w:name="_4d49e616ee89cd6b306fc71b95b459aabb9e7db"/>
+      <w:r>
+        <w:rPr>
+          <w:color w:val="000000"/>
+        </w:rPr>
         <w:t xml:space="preserve">Lossless decomposition</w:t>
       </w:r>
+      <w:bookmarkEnd w:id="15"/>
     </w:p>
     <w:p>
       <w:pPr>
         <w:pStyle w:val="FirstParagraph"/>
+        <w:widowControl/>
       </w:pPr>
       <w:r>
         <w:t xml:space="preserve">For each binary split, the intersection determines one side:</w:t>
@@ -1330,6 +1884,7 @@
     <w:p>
       <w:pPr>
         <w:pStyle w:val="Compact"/>
+        <w:widowControl/>
         <w:numPr>
           <w:ilvl w:val="0"/>
           <w:numId w:val="1002"/>
@@ -1342,6 +1897,7 @@
     <w:p>
       <w:pPr>
         <w:pStyle w:val="Compact"/>
+        <w:widowControl/>
         <w:numPr>
           <w:ilvl w:val="0"/>
           <w:numId w:val="1002"/>
@@ -1366,6 +1922,7 @@
     <w:p>
       <w:pPr>
         <w:pStyle w:val="Compact"/>
+        <w:widowControl/>
         <w:numPr>
           <w:ilvl w:val="0"/>
           <w:numId w:val="1002"/>
@@ -1378,6 +1935,7 @@
     <w:p>
       <w:pPr>
         <w:pStyle w:val="FirstParagraph"/>
+        <w:widowControl/>
       </w:pPr>
       <w:r>
         <w:t xml:space="preserve">Each split therefore meets the FD-based binary lossless-join criterion. Their composition is lossless for the ownership relation, subject to its stated dependencies. Transfers represents a</w:t>
@@ -1396,19 +1954,24 @@
         <w:t xml:space="preserve">; it is not obtained by naturally joining every ownership row. Blindly joining all five tables can multiply events for joint owners and is not a valid universal-relation proof.</w:t>
       </w:r>
     </w:p>
-    <w:bookmarkEnd w:id="24"/>
-    <w:bookmarkStart w:id="25" w:name="dependency-preservation"/>
     <w:p>
       <w:pPr>
         <w:pStyle w:val="Heading3"/>
-      </w:pPr>
-      <w:r>
+        <w:widowControl/>
+      </w:pPr>
+      <w:bookmarkStart w:id="16" w:name="_decfde83d44de76e7789d2976a305a135df4437"/>
+      <w:r>
+        <w:rPr>
+          <w:color w:val="000000"/>
+        </w:rPr>
         <w:t xml:space="preserve">Dependency preservation</w:t>
       </w:r>
+      <w:bookmarkEnd w:id="16"/>
     </w:p>
     <w:p>
       <w:pPr>
         <w:pStyle w:val="FirstParagraph"/>
+        <w:widowControl/>
       </w:pPr>
       <w:r>
         <w:t xml:space="preserve">The user, bank, account, and ownership determinants remain inside their corresponding relations. Transfer identity and idempotency dependencies remain inside Transfers. PK/UNIQUE constraints enforce those FDs without joining tables. FKs enforce referential integrity but are inclusion dependencies, not a replacement for FD-based normalization.</w:t>
@@ -1417,63 +1980,10 @@
     <w:p>
       <w:pPr>
         <w:pStyle w:val="BodyText"/>
-      </w:pPr>
-      <w:r>
-        <w:t xml:space="preserve">“</w:t>
-      </w:r>
-      <w:r>
-        <w:t xml:space="preserve">Source belongs to initiator,</w:t>
-      </w:r>
-      <w:r>
-        <w:t xml:space="preserve">”</w:t>
-      </w:r>
-      <w:r>
-        <w:t xml:space="preserve"> </w:t>
-      </w:r>
-      <w:r>
-        <w:t xml:space="preserve">“</w:t>
-      </w:r>
-      <w:r>
-        <w:t xml:space="preserve">sufficient balance,</w:t>
-      </w:r>
-      <w:r>
-        <w:t xml:space="preserve">”</w:t>
-      </w:r>
-      <w:r>
-        <w:t xml:space="preserve"> </w:t>
-      </w:r>
-      <w:r>
-        <w:t xml:space="preserve">“</w:t>
-      </w:r>
-      <w:r>
-        <w:t xml:space="preserve">both accounts active,</w:t>
-      </w:r>
-      <w:r>
-        <w:t xml:space="preserve">”</w:t>
-      </w:r>
-      <w:r>
-        <w:t xml:space="preserve"> </w:t>
-      </w:r>
-      <w:r>
-        <w:t xml:space="preserve">and</w:t>
-      </w:r>
-      <w:r>
-        <w:t xml:space="preserve"> </w:t>
-      </w:r>
-      <w:r>
-        <w:t xml:space="preserve">“</w:t>
-      </w:r>
-      <w:r>
-        <w:t xml:space="preserve">money is conserved</w:t>
-      </w:r>
-      <w:r>
-        <w:t xml:space="preserve">”</w:t>
-      </w:r>
-      <w:r>
-        <w:t xml:space="preserve"> </w:t>
-      </w:r>
-      <w:r>
-        <w:t xml:space="preserve">span rows/relations. They are</w:t>
+        <w:widowControl/>
+      </w:pPr>
+      <w:r>
+        <w:t xml:space="preserve">“Source belongs to initiator,” “sufficient balance,” “both accounts active,” and “money is conserved” span rows/relations. They are</w:t>
       </w:r>
       <w:r>
         <w:t xml:space="preserve"> </w:t>
@@ -1489,20 +1999,24 @@
         <w:t xml:space="preserve">, not ordinary FDs or consequences of BCNF. The controlled transfer transaction enforces them. Minimum one holder per account is enforced by the supported creation workflow, not a general SQL assertion.</w:t>
       </w:r>
     </w:p>
-    <w:bookmarkEnd w:id="25"/>
-    <w:bookmarkEnd w:id="26"/>
-    <w:bookmarkStart w:id="27" w:name="transaction-design"/>
     <w:p>
       <w:pPr>
         <w:pStyle w:val="Heading2"/>
-      </w:pPr>
-      <w:r>
+        <w:widowControl/>
+      </w:pPr>
+      <w:bookmarkStart w:id="17" w:name="_bd56508fb17472746f08b55be49e4765ae0efda"/>
+      <w:r>
+        <w:rPr>
+          <w:color w:val="000000"/>
+        </w:rPr>
         <w:t xml:space="preserve">Transaction design</w:t>
       </w:r>
+      <w:bookmarkEnd w:id="17"/>
     </w:p>
     <w:p>
       <w:pPr>
         <w:pStyle w:val="FirstParagraph"/>
+        <w:widowControl/>
       </w:pPr>
       <w:r>
         <w:rPr>
@@ -1517,6 +2031,7 @@
     <w:p>
       <w:pPr>
         <w:pStyle w:val="Compact"/>
+        <w:widowControl/>
         <w:numPr>
           <w:ilvl w:val="0"/>
           <w:numId w:val="1003"/>
@@ -1529,6 +2044,7 @@
     <w:p>
       <w:pPr>
         <w:pStyle w:val="Compact"/>
+        <w:widowControl/>
         <w:numPr>
           <w:ilvl w:val="0"/>
           <w:numId w:val="1003"/>
@@ -1541,6 +2057,7 @@
     <w:p>
       <w:pPr>
         <w:pStyle w:val="Compact"/>
+        <w:widowControl/>
         <w:numPr>
           <w:ilvl w:val="0"/>
           <w:numId w:val="1003"/>
@@ -1553,18 +2070,20 @@
     <w:p>
       <w:pPr>
         <w:pStyle w:val="Compact"/>
+        <w:widowControl/>
         <w:numPr>
           <w:ilvl w:val="0"/>
           <w:numId w:val="1003"/>
         </w:numPr>
       </w:pPr>
       <w:r>
-        <w:t xml:space="preserve">Verify source ownership from AccountHolders. Future ownership-revocation workflows must coordinate with this check; revocation is not implemented now.</w:t>
+        <w:t xml:space="preserve">Verify source ownership from AccountHolders. Existing owners may add an equal joint owner through the controlled add_account_holder function. Revocation is not implemented; any future revocation workflow must coordinate with transfer authorization.</w:t>
       </w:r>
     </w:p>
     <w:p>
       <w:pPr>
         <w:pStyle w:val="Compact"/>
+        <w:widowControl/>
         <w:numPr>
           <w:ilvl w:val="0"/>
           <w:numId w:val="1003"/>
@@ -1589,6 +2108,7 @@
     <w:p>
       <w:pPr>
         <w:pStyle w:val="Compact"/>
+        <w:widowControl/>
         <w:numPr>
           <w:ilvl w:val="0"/>
           <w:numId w:val="1003"/>
@@ -1601,6 +2121,7 @@
     <w:p>
       <w:pPr>
         <w:pStyle w:val="Compact"/>
+        <w:widowControl/>
         <w:numPr>
           <w:ilvl w:val="0"/>
           <w:numId w:val="1003"/>
@@ -1613,6 +2134,7 @@
     <w:p>
       <w:pPr>
         <w:pStyle w:val="FirstParagraph"/>
+        <w:widowControl/>
       </w:pPr>
       <w:r>
         <w:t xml:space="preserve">READ COMMITTED with explicit account locks serializes conflicting balance updates. A waiting transaction sees the updated balance before its check. A consistent order prevents the classic A→B / B→A deadlock. The service must return success only after the database connection context commits. Unrelated account pairs can proceed independently; same-key retries serialize even if payload account pairs differ. There is no claim of serializability for arbitrary future workflows.</w:t>
@@ -1621,9 +2143,10 @@
     <w:p>
       <w:pPr>
         <w:pStyle w:val="BodyText"/>
-      </w:pPr>
-      <w:r>
-        <w:t xml:space="preserve">The private backend role cannot directly UPDATE balances, DELETE history, or INSERT transfers. It can read application relations, register users, and invoke the controlled functions. The functions are SECURITY DEFINER, have fixed</w:t>
+        <w:widowControl/>
+      </w:pPr>
+      <w:r>
+        <w:t xml:space="preserve">The private backend role cannot directly UPDATE balances, DELETE history, or INSERT transfers. It can read application relations, register users, and invoke the controlled opening, ownership, and transfer functions. The functions are SECURITY DEFINER, have fixed</w:t>
       </w:r>
       <w:r>
         <w:t xml:space="preserve"> </w:t>
@@ -1657,19 +2180,24 @@
         <w:t xml:space="preserve">an untrusted browser field. The backend role remains a trusted identity boundary: possession of its DB credentials permits impersonating actors via the function, which is why they must never reach the frontend.</w:t>
       </w:r>
     </w:p>
-    <w:bookmarkEnd w:id="27"/>
-    <w:bookmarkStart w:id="28" w:name="balance-reconciliation-and-recovery"/>
     <w:p>
       <w:pPr>
         <w:pStyle w:val="Heading2"/>
-      </w:pPr>
-      <w:r>
+        <w:widowControl/>
+      </w:pPr>
+      <w:bookmarkStart w:id="18" w:name="_b19bdd9a0bdedeaf2bd757d1178c1563203df49"/>
+      <w:r>
+        <w:rPr>
+          <w:color w:val="000000"/>
+        </w:rPr>
         <w:t xml:space="preserve">Balance reconciliation and recovery</w:t>
       </w:r>
+      <w:bookmarkEnd w:id="18"/>
     </w:p>
     <w:p>
       <w:pPr>
         <w:pStyle w:val="FirstParagraph"/>
+        <w:widowControl/>
       </w:pPr>
       <w:r>
         <w:t xml:space="preserve">For account a:</w:t>
@@ -1678,6 +2206,7 @@
     <w:p>
       <w:pPr>
         <w:pStyle w:val="BodyText"/>
+        <w:widowControl/>
       </w:pPr>
       <w:r>
         <w:rPr>
@@ -1692,6 +2221,7 @@
     <w:p>
       <w:pPr>
         <w:pStyle w:val="BodyText"/>
+        <w:widowControl/>
       </w:pPr>
       <w:r>
         <w:t xml:space="preserve">The materialized balance speeds sufficiency checks. It is a cross-relation aggregate redundancy, not an additional FD that invalidates BCNF. The transaction keeps the aggregate consistent; the reconciliation query independently detects divergence. Opening balances record initial simulated funding. New accounts create an explicit simulated allocation; only transfers between existing accounts conserve the total. No physical cash or regulatory balance is implied.</w:t>
@@ -1700,6 +2230,7 @@
     <w:p>
       <w:pPr>
         <w:pStyle w:val="BodyText"/>
+        <w:widowControl/>
       </w:pPr>
       <w:r>
         <w:t xml:space="preserve">PostgreSQL’s normal WAL/commit machinery provides durability and recovery; the application does not implement its own recovery log. Tests demonstrate transaction rollback,</w:t>
@@ -1721,19 +2252,24 @@
         <w:t xml:space="preserve">power-failure recovery, backup restoration, or Supabase point-in-time recovery. Those remain future validation tasks. Privileged administrators can modify data; this is not an immutable double-entry ledger.</w:t>
       </w:r>
     </w:p>
-    <w:bookmarkEnd w:id="28"/>
-    <w:bookmarkStart w:id="29" w:name="physical-design-and-query-processing"/>
     <w:p>
       <w:pPr>
         <w:pStyle w:val="Heading2"/>
-      </w:pPr>
-      <w:r>
+        <w:widowControl/>
+      </w:pPr>
+      <w:bookmarkStart w:id="19" w:name="_c2327180cef65e81f17db0b6a67cb8c51e051dc"/>
+      <w:r>
+        <w:rPr>
+          <w:color w:val="000000"/>
+        </w:rPr>
         <w:t xml:space="preserve">Physical design and query processing</w:t>
       </w:r>
+      <w:bookmarkEnd w:id="19"/>
     </w:p>
     <w:p>
       <w:pPr>
         <w:pStyle w:val="FirstParagraph"/>
+        <w:widowControl/>
       </w:pPr>
       <w:r>
         <w:t xml:space="preserve">UUID PKs and UNIQUE constraints create B-tree indexes. Additional indexes cover reverse ownership lookup and source/destination histories ordered by</w:t>
@@ -1754,6 +2290,7 @@
     <w:p>
       <w:pPr>
         <w:pStyle w:val="BodyText"/>
+        <w:widowControl/>
       </w:pPr>
       <w:r>
         <w:rPr>
@@ -1780,15 +2317,70 @@
         <w:t xml:space="preserve">. Its synthetic rows and index drop are rolled back. It isolates the outgoing-history query; it does not prove that the entire UI history query or hosted workload has the same plan or speed.</w:t>
       </w:r>
     </w:p>
-    <w:bookmarkEnd w:id="29"/>
-    <w:bookmarkEnd w:id="30"/>
-    <w:sectPr/>
+    <w:p>
+      <w:pPr>
+        <w:pStyle w:val="Heading2"/>
+        <w:widowControl/>
+      </w:pPr>
+      <w:bookmarkStart w:id="20" w:name="_41f1639bee23172c1edca7483494f87a745b911"/>
+      <w:r>
+        <w:rPr>
+          <w:color w:val="000000"/>
+        </w:rPr>
+        <w:t xml:space="preserve">Joint ownership and calendar semantics</w:t>
+      </w:r>
+      <w:bookmarkEnd w:id="20"/>
+    </w:p>
+    <w:p>
+      <w:pPr>
+        <w:pStyle w:val="FirstParagraph"/>
+        <w:widowControl/>
+      </w:pPr>
+      <w:r>
+        <w:t xml:space="preserve">The Accounts screen lets an existing owner add a registered user by exact username. This simulation grants immediate equal read/spending access; it does not implement invitation acceptance or removal. The function locks the target user row before the account row, checks active status and the acting user’s ownership, returns an existing ownership pair on retry, checks the target’s four-account limit, and inserts only the ownership row. No balance or opening balance changes. The user-before-account order matches account opening and serializes competing allocation requests for the same target. Transfers lock account rows in UUID order; insertion also takes an implicit FK KEY SHARE lock on the initiating user. Allocation functions use FOR NO KEY UPDATE on the target user so this FK check remains compatible. Using FOR UPDATE there could introduce a user/account lock cycle; a regression test holds a joint-owner grant open while an unrelated transfer by that target completes.</w:t>
+      </w:r>
+    </w:p>
+    <w:p>
+      <w:pPr>
+        <w:pStyle w:val="BodyText"/>
+        <w:widowControl/>
+      </w:pPr>
+      <w:r>
+        <w:t xml:space="preserve">Monthly and seven-day insights use America/Chicago calendar boundaries. Timestamps remain timestamptz instants and the browser formats them locally. Internal transfers are excluded from monthly money in/out and included on both sides of the weekly volume chart. History and CSV are limited to the latest 200 rows; account totals count each account once per signed-in user.</w:t>
+      </w:r>
+    </w:p>
+    <w:sectPr>
+      <w:footerReference w:type="default" r:id="rId9"/>
+      <w:footnotePr>
+        <w:numRestart w:val="eachSect"/>
+      </w:footnotePr>
+      <w:pgSz w:w="12240" w:h="15840"/>
+      <w:pgMar w:top="1152" w:bottom="1152" w:left="1152" w:right="1152" w:header="432" w:footer="432"/>
+    </w:sectPr>
   </w:body>
 </w:document>
 </file>
 
 <file path=word/comments.xml><?xml version="1.0" encoding="utf-8"?>
 <w:comments xmlns:w="http://schemas.openxmlformats.org/wordprocessingml/2006/main" xmlns:m="http://schemas.openxmlformats.org/officeDocument/2006/math" xmlns:r="http://schemas.openxmlformats.org/officeDocument/2006/relationships" xmlns:o="urn:schemas-microsoft-com:office:office" xmlns:v="urn:schemas-microsoft-com:vml" xmlns:w10="urn:schemas-microsoft-com:office:word" xmlns:a="http://schemas.openxmlformats.org/drawingml/2006/main" xmlns:pic="http://schemas.openxmlformats.org/drawingml/2006/picture" xmlns:wp="http://schemas.openxmlformats.org/drawingml/2006/wordprocessingDrawing"/>
+</file>
+
+<file path=word/footer1.xml><?xml version="1.0" encoding="utf-8"?>
+<w:ftr xmlns:m="http://schemas.openxmlformats.org/officeDocument/2006/math" xmlns:mc="http://schemas.openxmlformats.org/markup-compatibility/2006" xmlns:mo="http://schemas.microsoft.com/office/mac/office/2008/main" xmlns:mv="urn:schemas-microsoft-com:mac:vml" xmlns:o="urn:schemas-microsoft-com:office:office" xmlns:r="http://schemas.openxmlformats.org/officeDocument/2006/relationships" xmlns:v="urn:schemas-microsoft-com:vml" xmlns:w10="urn:schemas-microsoft-com:office:word" xmlns:w14="http://schemas.microsoft.com/office/word/2010/wordml" xmlns:w="http://schemas.openxmlformats.org/wordprocessingml/2006/main" xmlns:wne="http://schemas.microsoft.com/office/word/2006/wordml" xmlns:wp14="http://schemas.microsoft.com/office/word/2010/wordprocessingDrawing" xmlns:wp="http://schemas.openxmlformats.org/drawingml/2006/wordprocessingDrawing" xmlns:wpc="http://schemas.microsoft.com/office/word/2010/wordprocessingCanvas" xmlns:wpg="http://schemas.microsoft.com/office/word/2010/wordprocessingGroup" xmlns:wpi="http://schemas.microsoft.com/office/word/2010/wordprocessingInk" xmlns:wps="http://schemas.microsoft.com/office/word/2010/wordprocessingShape" mc:Ignorable="w14 wp14">
+  <w:p>
+    <w:pPr>
+      <w:pStyle w:val="Footer"/>
+      <w:jc w:val="center"/>
+    </w:pPr>
+    <w:r>
+      <w:rPr>
+        <w:sz w:val="16"/>
+      </w:rPr>
+      <w:t xml:space="preserve">PayLink | CS 5600 | </w:t>
+    </w:r>
+    <w:fldSimple w:instr="PAGE"/>
+  </w:p>
+</w:ftr>
 </file>
 
 <file path=word/footnotes.xml><?xml version="1.0" encoding="utf-8"?>
@@ -1820,7 +2412,7 @@
       <w:lvlText w:val=" "/>
       <w:lvlJc w:val="left"/>
       <w:pPr>
-        <w:ind w:left="720" w:hanging="480"/>
+        <w:ind w:left="720" w:hanging="360"/>
       </w:pPr>
     </w:lvl>
     <w:lvl w:ilvl="1">
@@ -1828,7 +2420,7 @@
       <w:lvlText w:val=" "/>
       <w:lvlJc w:val="left"/>
       <w:pPr>
-        <w:ind w:left="1440" w:hanging="480"/>
+        <w:ind w:left="1440" w:hanging="360"/>
       </w:pPr>
     </w:lvl>
     <w:lvl w:ilvl="2">
@@ -1836,7 +2428,7 @@
       <w:lvlText w:val=" "/>
       <w:lvlJc w:val="left"/>
       <w:pPr>
-        <w:ind w:left="2160" w:hanging="480"/>
+        <w:ind w:left="2160" w:hanging="360"/>
       </w:pPr>
     </w:lvl>
     <w:lvl w:ilvl="3">
@@ -1844,7 +2436,7 @@
       <w:lvlText w:val=" "/>
       <w:lvlJc w:val="left"/>
       <w:pPr>
-        <w:ind w:left="2880" w:hanging="480"/>
+        <w:ind w:left="2880" w:hanging="360"/>
       </w:pPr>
     </w:lvl>
     <w:lvl w:ilvl="4">
@@ -1852,7 +2444,7 @@
       <w:lvlText w:val=" "/>
       <w:lvlJc w:val="left"/>
       <w:pPr>
-        <w:ind w:left="3600" w:hanging="480"/>
+        <w:ind w:left="3600" w:hanging="360"/>
       </w:pPr>
     </w:lvl>
     <w:lvl w:ilvl="5">
@@ -1860,7 +2452,7 @@
       <w:lvlText w:val=" "/>
       <w:lvlJc w:val="left"/>
       <w:pPr>
-        <w:ind w:left="4320" w:hanging="480"/>
+        <w:ind w:left="4320" w:hanging="360"/>
       </w:pPr>
     </w:lvl>
     <w:lvl w:ilvl="6">
@@ -1868,7 +2460,7 @@
       <w:lvlText w:val=" "/>
       <w:lvlJc w:val="left"/>
       <w:pPr>
-        <w:ind w:left="5040" w:hanging="480"/>
+        <w:ind w:left="5040" w:hanging="360"/>
       </w:pPr>
     </w:lvl>
     <w:lvl w:ilvl="7">
@@ -1876,7 +2468,7 @@
       <w:lvlText w:val=" "/>
       <w:lvlJc w:val="left"/>
       <w:pPr>
-        <w:ind w:left="5760" w:hanging="480"/>
+        <w:ind w:left="5760" w:hanging="360"/>
       </w:pPr>
     </w:lvl>
     <w:lvl w:ilvl="8">
@@ -1884,7 +2476,7 @@
       <w:lvlText w:val=" "/>
       <w:lvlJc w:val="left"/>
       <w:pPr>
-        <w:ind w:left="6480" w:hanging="480"/>
+        <w:ind w:left="6480" w:hanging="360"/>
       </w:pPr>
     </w:lvl>
   </w:abstractNum>
@@ -1893,75 +2485,102 @@
     <w:multiLevelType w:val="multilevel"/>
     <w:lvl w:ilvl="0">
       <w:numFmt w:val="bullet"/>
-      <w:lvlText w:val="•"/>
+      <w:lvlText w:val=""/>
       <w:lvlJc w:val="left"/>
       <w:pPr>
-        <w:ind w:left="720" w:hanging="480"/>
-      </w:pPr>
+        <w:ind w:left="720" w:hanging="360"/>
+      </w:pPr>
+      <w:rPr>
+        <w:rFonts w:ascii="Symbol" w:hAnsi="Symbol" w:cs="Symbol" w:hint="default"/>
+      </w:rPr>
     </w:lvl>
     <w:lvl w:ilvl="1">
       <w:numFmt w:val="bullet"/>
-      <w:lvlText w:val="–"/>
+      <w:lvlText w:val="o"/>
       <w:lvlJc w:val="left"/>
       <w:pPr>
-        <w:ind w:left="1440" w:hanging="480"/>
-      </w:pPr>
+        <w:ind w:left="1440" w:hanging="360"/>
+      </w:pPr>
+      <w:rPr>
+        <w:rFonts w:ascii="Courier New" w:hAnsi="Courier New" w:cs="Courier New" w:hint="default"/>
+      </w:rPr>
     </w:lvl>
     <w:lvl w:ilvl="2">
       <w:numFmt w:val="bullet"/>
-      <w:lvlText w:val="•"/>
+      <w:lvlText w:val=""/>
       <w:lvlJc w:val="left"/>
       <w:pPr>
-        <w:ind w:left="2160" w:hanging="480"/>
-      </w:pPr>
+        <w:ind w:left="2160" w:hanging="360"/>
+      </w:pPr>
+      <w:rPr>
+        <w:rFonts w:ascii="Wingdings" w:hAnsi="Wingdings" w:cs="Wingdings" w:hint="default"/>
+      </w:rPr>
     </w:lvl>
     <w:lvl w:ilvl="3">
       <w:numFmt w:val="bullet"/>
-      <w:lvlText w:val="–"/>
+      <w:lvlText w:val=""/>
       <w:lvlJc w:val="left"/>
       <w:pPr>
-        <w:ind w:left="2880" w:hanging="480"/>
-      </w:pPr>
+        <w:ind w:left="2880" w:hanging="360"/>
+      </w:pPr>
+      <w:rPr>
+        <w:rFonts w:ascii="Symbol" w:hAnsi="Symbol" w:cs="Symbol" w:hint="default"/>
+      </w:rPr>
     </w:lvl>
     <w:lvl w:ilvl="4">
       <w:numFmt w:val="bullet"/>
-      <w:lvlText w:val="•"/>
+      <w:lvlText w:val="o"/>
       <w:lvlJc w:val="left"/>
       <w:pPr>
-        <w:ind w:left="3600" w:hanging="480"/>
-      </w:pPr>
+        <w:ind w:left="3600" w:hanging="360"/>
+      </w:pPr>
+      <w:rPr>
+        <w:rFonts w:ascii="Courier New" w:hAnsi="Courier New" w:cs="Courier New" w:hint="default"/>
+      </w:rPr>
     </w:lvl>
     <w:lvl w:ilvl="5">
       <w:numFmt w:val="bullet"/>
-      <w:lvlText w:val="–"/>
+      <w:lvlText w:val=""/>
       <w:lvlJc w:val="left"/>
       <w:pPr>
-        <w:ind w:left="4320" w:hanging="480"/>
-      </w:pPr>
+        <w:ind w:left="4320" w:hanging="360"/>
+      </w:pPr>
+      <w:rPr>
+        <w:rFonts w:ascii="Wingdings" w:hAnsi="Wingdings" w:cs="Wingdings" w:hint="default"/>
+      </w:rPr>
     </w:lvl>
     <w:lvl w:ilvl="6">
       <w:numFmt w:val="bullet"/>
-      <w:lvlText w:val="•"/>
+      <w:lvlText w:val=""/>
       <w:lvlJc w:val="left"/>
       <w:pPr>
-        <w:ind w:left="5040" w:hanging="480"/>
-      </w:pPr>
+        <w:ind w:left="5040" w:hanging="360"/>
+      </w:pPr>
+      <w:rPr>
+        <w:rFonts w:ascii="Symbol" w:hAnsi="Symbol" w:cs="Symbol" w:hint="default"/>
+      </w:rPr>
     </w:lvl>
     <w:lvl w:ilvl="7">
       <w:numFmt w:val="bullet"/>
-      <w:lvlText w:val="–"/>
+      <w:lvlText w:val="o"/>
       <w:lvlJc w:val="left"/>
       <w:pPr>
-        <w:ind w:left="5760" w:hanging="480"/>
-      </w:pPr>
+        <w:ind w:left="5760" w:hanging="360"/>
+      </w:pPr>
+      <w:rPr>
+        <w:rFonts w:ascii="Courier New" w:hAnsi="Courier New" w:cs="Courier New" w:hint="default"/>
+      </w:rPr>
     </w:lvl>
     <w:lvl w:ilvl="8">
       <w:numFmt w:val="bullet"/>
-      <w:lvlText w:val="•"/>
+      <w:lvlText w:val=""/>
       <w:lvlJc w:val="left"/>
       <w:pPr>
-        <w:ind w:left="6480" w:hanging="480"/>
-      </w:pPr>
+        <w:ind w:left="6480" w:hanging="360"/>
+      </w:pPr>
+      <w:rPr>
+        <w:rFonts w:ascii="Wingdings" w:hAnsi="Wingdings" w:cs="Wingdings" w:hint="default"/>
+      </w:rPr>
     </w:lvl>
   </w:abstractNum>
   <w:abstractNum w:abstractNumId="99411">
@@ -1973,7 +2592,7 @@
       <w:lvlText w:val="%1."/>
       <w:lvlJc w:val="left"/>
       <w:pPr>
-        <w:ind w:left="720" w:hanging="480"/>
+        <w:ind w:left="720" w:hanging="360"/>
       </w:pPr>
     </w:lvl>
     <w:lvl w:ilvl="1">
@@ -1982,7 +2601,7 @@
       <w:lvlText w:val="%2."/>
       <w:lvlJc w:val="left"/>
       <w:pPr>
-        <w:ind w:left="1440" w:hanging="480"/>
+        <w:ind w:left="1440" w:hanging="360"/>
       </w:pPr>
     </w:lvl>
     <w:lvl w:ilvl="2">
@@ -1991,7 +2610,7 @@
       <w:lvlText w:val="%3."/>
       <w:lvlJc w:val="left"/>
       <w:pPr>
-        <w:ind w:left="2160" w:hanging="480"/>
+        <w:ind w:left="2160" w:hanging="360"/>
       </w:pPr>
     </w:lvl>
     <w:lvl w:ilvl="3">
@@ -2000,7 +2619,7 @@
       <w:lvlText w:val="%4."/>
       <w:lvlJc w:val="left"/>
       <w:pPr>
-        <w:ind w:left="2880" w:hanging="480"/>
+        <w:ind w:left="2880" w:hanging="360"/>
       </w:pPr>
     </w:lvl>
     <w:lvl w:ilvl="4">
@@ -2009,7 +2628,7 @@
       <w:lvlText w:val="%5."/>
       <w:lvlJc w:val="left"/>
       <w:pPr>
-        <w:ind w:left="3600" w:hanging="480"/>
+        <w:ind w:left="3600" w:hanging="360"/>
       </w:pPr>
     </w:lvl>
     <w:lvl w:ilvl="5">
@@ -2018,7 +2637,7 @@
       <w:lvlText w:val="%6."/>
       <w:lvlJc w:val="left"/>
       <w:pPr>
-        <w:ind w:left="4320" w:hanging="480"/>
+        <w:ind w:left="4320" w:hanging="360"/>
       </w:pPr>
     </w:lvl>
     <w:lvl w:ilvl="6">
@@ -2027,7 +2646,7 @@
       <w:lvlText w:val="%7."/>
       <w:lvlJc w:val="left"/>
       <w:pPr>
-        <w:ind w:left="5040" w:hanging="480"/>
+        <w:ind w:left="5040" w:hanging="360"/>
       </w:pPr>
     </w:lvl>
     <w:lvl w:ilvl="7">
@@ -2036,7 +2655,7 @@
       <w:lvlText w:val="%8."/>
       <w:lvlJc w:val="left"/>
       <w:pPr>
-        <w:ind w:left="5760" w:hanging="480"/>
+        <w:ind w:left="5760" w:hanging="360"/>
       </w:pPr>
     </w:lvl>
     <w:lvl w:ilvl="8">
@@ -2045,7 +2664,7 @@
       <w:lvlText w:val="%9."/>
       <w:lvlJc w:val="left"/>
       <w:pPr>
-        <w:ind w:left="6480" w:hanging="480"/>
+        <w:ind w:left="6480" w:hanging="360"/>
       </w:pPr>
     </w:lvl>
   </w:abstractNum>
@@ -2123,10 +2742,10 @@
   <w:docDefaults>
     <w:rPrDefault>
       <w:rPr>
-        <w:rFonts w:asciiTheme="minorHAnsi" w:cstheme="minorBidi" w:eastAsiaTheme="minorHAnsi" w:hAnsiTheme="minorHAnsi"/>
+        <w:rFonts w:asciiTheme="minorHAnsi" w:eastAsiaTheme="minorEastAsia" w:hAnsiTheme="minorHAnsi" w:cstheme="minorBidi"/>
         <w:sz w:val="24"/>
         <w:szCs w:val="24"/>
-        <w:lang w:bidi="ar-SA" w:eastAsia="en-US" w:val="en-US"/>
+        <w:lang w:val="en-US" w:eastAsia="zh-CN" w:bidi="ar-SA"/>
       </w:rPr>
     </w:rPrDefault>
     <w:pPrDefault>
@@ -2135,91 +2754,141 @@
       </w:pPr>
     </w:pPrDefault>
   </w:docDefaults>
-  <w:latentStyles w:count="276" w:defLockedState="0" w:defQFormat="0" w:defSemiHidden="0" w:defUIPriority="0" w:defUnhideWhenUsed="0"/>
-  <w:style w:default="1" w:styleId="Normal" w:type="paragraph">
+  <w:latentStyles w:defLockedState="0" w:defUIPriority="0" w:defSemiHidden="0" w:defUnhideWhenUsed="0" w:defQFormat="0" w:count="276"/>
+  <w:style w:type="paragraph" w:default="1" w:styleId="Normal">
     <w:name w:val="Normal"/>
     <w:qFormat/>
-  </w:style>
-  <w:style w:styleId="BodyText" w:type="paragraph">
+    <w:pPr>
+      <w:spacing w:after="140" w:line="269" w:lineRule="auto"/>
+    </w:pPr>
+    <w:rPr>
+      <w:rFonts w:ascii="Arial" w:hAnsi="Arial"/>
+      <w:color w:val="202D38"/>
+      <w:sz w:val="22"/>
+    </w:rPr>
+  </w:style>
+  <w:style w:type="paragraph" w:styleId="BodyText">
     <w:name w:val="Body Text"/>
     <w:basedOn w:val="Normal"/>
     <w:link w:val="BodyTextChar"/>
     <w:qFormat/>
     <w:pPr>
-      <w:spacing w:after="180" w:before="180"/>
+      <w:spacing w:before="180" w:after="180"/>
     </w:pPr>
   </w:style>
-  <w:style w:customStyle="1" w:styleId="FirstParagraph" w:type="paragraph">
+  <w:style w:type="paragraph" w:customStyle="1" w:styleId="FirstParagraph">
     <w:name w:val="First Paragraph"/>
     <w:basedOn w:val="BodyText"/>
     <w:next w:val="BodyText"/>
     <w:qFormat/>
   </w:style>
-  <w:style w:customStyle="1" w:styleId="Compact" w:type="paragraph">
+  <w:style w:type="paragraph" w:customStyle="1" w:styleId="Compact">
     <w:name w:val="Compact"/>
     <w:basedOn w:val="BodyText"/>
     <w:qFormat/>
     <w:pPr>
-      <w:spacing w:after="36" w:before="36"/>
+      <w:spacing w:before="36" w:after="36"/>
     </w:pPr>
   </w:style>
-  <w:style w:styleId="Title" w:type="paragraph">
+  <w:style w:type="paragraph" w:styleId="Title">
     <w:name w:val="Title"/>
     <w:basedOn w:val="Normal"/>
     <w:next w:val="BodyText"/>
+    <w:link w:val="TitleChar"/>
+    <w:uiPriority w:val="10"/>
     <w:qFormat/>
+    <w:rsid w:val="00A10FD9"/>
     <w:pPr>
       <w:keepNext/>
-      <w:keepLines/>
-      <w:spacing w:after="240" w:before="480"/>
+      <w:spacing w:after="140" w:line="240" w:lineRule="auto" w:before="0"/>
+      <w:contextualSpacing/>
       <w:jc w:val="center"/>
     </w:pPr>
     <w:rPr>
-      <w:rFonts w:asciiTheme="majorHAnsi" w:cstheme="majorBidi" w:eastAsiaTheme="majorEastAsia" w:hAnsiTheme="majorHAnsi"/>
-      <w:b/>
-      <w:bCs/>
-      <w:color w:themeColor="accent1" w:themeShade="B5" w:val="345A8A"/>
-      <w:sz w:val="36"/>
-      <w:szCs w:val="36"/>
-    </w:rPr>
-  </w:style>
-  <w:style w:styleId="Subtitle" w:type="paragraph">
+      <w:rFonts w:asciiTheme="majorHAnsi" w:eastAsiaTheme="majorEastAsia" w:hAnsiTheme="majorHAnsi" w:cstheme="majorBidi" w:ascii="Arial" w:hAnsi="Arial"/>
+      <w:color w:val="000000"/>
+      <w:sz w:val="48"/>
+      <w:szCs w:val="56"/>
+    </w:rPr>
+  </w:style>
+  <w:style w:type="character" w:customStyle="1" w:styleId="TitleChar">
+    <w:name w:val="Title Char"/>
+    <w:basedOn w:val="DefaultParagraphFont"/>
+    <w:link w:val="Title"/>
+    <w:uiPriority w:val="10"/>
+    <w:rsid w:val="00A10FD9"/>
+    <w:rPr>
+      <w:rFonts w:asciiTheme="majorHAnsi" w:eastAsiaTheme="majorEastAsia" w:hAnsiTheme="majorHAnsi" w:cstheme="majorBidi"/>
+      <w:sz w:val="56"/>
+      <w:szCs w:val="56"/>
+    </w:rPr>
+  </w:style>
+  <w:style w:type="paragraph" w:styleId="Subtitle">
     <w:name w:val="Subtitle"/>
+    <w:basedOn w:val="Title"/>
+    <w:next w:val="BodyText"/>
+    <w:link w:val="SubtitleChar"/>
+    <w:uiPriority w:val="11"/>
+    <w:qFormat/>
+    <w:rsid w:val="00A10FD9"/>
+    <w:pPr>
+      <w:keepNext/>
+      <w:numPr>
+        <w:ilvl w:val="1"/>
+      </w:numPr>
+      <w:spacing w:before="280" w:after="140"/>
+    </w:pPr>
+    <w:rPr>
+      <w:rFonts w:eastAsiaTheme="majorEastAsia" w:cstheme="majorBidi" w:ascii="Arial" w:hAnsi="Arial"/>
+      <w:color w:val="000000"/>
+      <w:spacing w:val="15"/>
+      <w:sz w:val="24"/>
+      <w:szCs w:val="28"/>
+    </w:rPr>
+  </w:style>
+  <w:style w:type="character" w:customStyle="1" w:styleId="SubtitleChar">
+    <w:name w:val="Subtitle Char"/>
+    <w:basedOn w:val="DefaultParagraphFont"/>
+    <w:link w:val="Subtitle"/>
+    <w:uiPriority w:val="11"/>
+    <w:rsid w:val="00A10FD9"/>
+    <w:rPr>
+      <w:rFonts w:eastAsiaTheme="majorEastAsia" w:cstheme="majorBidi"/>
+      <w:color w:val="595959" w:themeColor="text1" w:themeTint="A6"/>
+      <w:spacing w:val="15"/>
+      <w:sz w:val="28"/>
+      <w:szCs w:val="28"/>
+    </w:rPr>
+  </w:style>
+  <w:style w:type="paragraph" w:customStyle="1" w:styleId="Author">
+    <w:name w:val="Author"/>
     <w:basedOn w:val="Title"/>
     <w:next w:val="BodyText"/>
     <w:qFormat/>
     <w:pPr>
       <w:keepNext/>
       <w:keepLines/>
-      <w:spacing w:after="240" w:before="240"/>
-      <w:jc w:val="center"/>
     </w:pPr>
     <w:rPr>
-      <w:sz w:val="30"/>
-      <w:szCs w:val="30"/>
-    </w:rPr>
-  </w:style>
-  <w:style w:customStyle="1" w:styleId="Author" w:type="paragraph">
-    <w:name w:val="Author"/>
+      <w:sz w:val="24"/>
+      <w:szCs w:val="24"/>
+    </w:rPr>
+  </w:style>
+  <w:style w:type="paragraph" w:styleId="Date">
+    <w:name w:val="Date"/>
+    <w:basedOn w:val="Title"/>
     <w:next w:val="BodyText"/>
     <w:qFormat/>
     <w:pPr>
       <w:keepNext/>
       <w:keepLines/>
-      <w:jc w:val="center"/>
     </w:pPr>
-  </w:style>
-  <w:style w:styleId="Date" w:type="paragraph">
-    <w:name w:val="Date"/>
-    <w:next w:val="BodyText"/>
-    <w:qFormat/>
-    <w:pPr>
-      <w:keepNext/>
-      <w:keepLines/>
-      <w:jc w:val="center"/>
-    </w:pPr>
-  </w:style>
-  <w:style w:customStyle="1" w:styleId="AbstractTitle" w:type="paragraph">
+    <w:rPr>
+      <w:sz w:val="24"/>
+      <w:szCs w:val="24"/>
+    </w:rPr>
+  </w:style>
+  <w:style w:type="paragraph" w:customStyle="1" w:styleId="AbstractTitle">
     <w:name w:val="Abstract Title"/>
     <w:basedOn w:val="Normal"/>
     <w:next w:val="Abstract"/>
@@ -2227,17 +2896,16 @@
     <w:pPr>
       <w:keepNext/>
       <w:keepLines/>
-      <w:spacing w:after="0" w:before="300"/>
+      <w:spacing w:before="300" w:after="0"/>
       <w:jc w:val="center"/>
     </w:pPr>
     <w:rPr>
       <w:b/>
-      <w:color w:val="345A8A"/>
       <w:sz w:val="20"/>
       <w:szCs w:val="20"/>
     </w:rPr>
   </w:style>
-  <w:style w:customStyle="1" w:styleId="Abstract" w:type="paragraph">
+  <w:style w:type="paragraph" w:customStyle="1" w:styleId="Abstract">
     <w:name w:val="Abstract"/>
     <w:basedOn w:val="Normal"/>
     <w:next w:val="BodyText"/>
@@ -2245,14 +2913,14 @@
     <w:pPr>
       <w:keepNext/>
       <w:keepLines/>
-      <w:spacing w:after="300" w:before="100"/>
+      <w:spacing w:before="100" w:after="300"/>
     </w:pPr>
     <w:rPr>
       <w:sz w:val="20"/>
       <w:szCs w:val="20"/>
     </w:rPr>
   </w:style>
-  <w:style w:styleId="Bibliography" w:type="paragraph">
+  <w:style w:type="paragraph" w:styleId="Bibliography">
     <w:name w:val="Bibliography"/>
     <w:basedOn w:val="Normal"/>
     <w:next w:val="Bibliography"/>
@@ -2260,195 +2928,325 @@
     <w:pPr/>
     <w:rPr/>
   </w:style>
-  <w:style w:styleId="Heading1" w:type="paragraph">
-    <w:name w:val="Heading 1"/>
+  <w:style w:type="paragraph" w:styleId="Heading1">
+    <w:name w:val="heading 1"/>
     <w:basedOn w:val="Normal"/>
     <w:next w:val="BodyText"/>
+    <w:link w:val="Heading1Char"/>
     <w:uiPriority w:val="9"/>
     <w:qFormat/>
+    <w:rsid w:val="00A10FD9"/>
     <w:pPr>
       <w:keepNext/>
       <w:keepLines/>
-      <w:spacing w:after="0" w:before="480"/>
+      <w:spacing w:before="280" w:after="140"/>
       <w:outlineLvl w:val="0"/>
     </w:pPr>
     <w:rPr>
-      <w:rFonts w:asciiTheme="majorHAnsi" w:cstheme="majorBidi" w:eastAsiaTheme="majorEastAsia" w:hAnsiTheme="majorHAnsi"/>
-      <w:b/>
-      <w:bCs/>
-      <w:color w:themeColor="accent1" w:val="4F81BD"/>
+      <w:rFonts w:asciiTheme="majorHAnsi" w:eastAsiaTheme="majorEastAsia" w:hAnsiTheme="majorHAnsi" w:cstheme="majorBidi" w:ascii="Arial" w:hAnsi="Arial"/>
+      <w:color w:val="000000"/>
       <w:sz w:val="32"/>
-      <w:szCs w:val="32"/>
-    </w:rPr>
-  </w:style>
-  <w:style w:styleId="Heading2" w:type="paragraph">
-    <w:name w:val="Heading 2"/>
+      <w:szCs w:val="40"/>
+    </w:rPr>
+  </w:style>
+  <w:style w:type="paragraph" w:styleId="Heading2">
+    <w:name w:val="heading 2"/>
     <w:basedOn w:val="Normal"/>
     <w:next w:val="BodyText"/>
+    <w:link w:val="Heading2Char"/>
     <w:uiPriority w:val="9"/>
+    <w:semiHidden/>
     <w:unhideWhenUsed/>
     <w:qFormat/>
+    <w:rsid w:val="00A10FD9"/>
     <w:pPr>
       <w:keepNext/>
       <w:keepLines/>
-      <w:spacing w:after="0" w:before="200"/>
+      <w:spacing w:before="280" w:after="140"/>
       <w:outlineLvl w:val="1"/>
     </w:pPr>
     <w:rPr>
-      <w:rFonts w:asciiTheme="majorHAnsi" w:cstheme="majorBidi" w:eastAsiaTheme="majorEastAsia" w:hAnsiTheme="majorHAnsi"/>
-      <w:b/>
-      <w:bCs/>
-      <w:color w:themeColor="accent1" w:val="4F81BD"/>
-      <w:sz w:val="28"/>
-      <w:szCs w:val="28"/>
-    </w:rPr>
-  </w:style>
-  <w:style w:styleId="Heading3" w:type="paragraph">
-    <w:name w:val="Heading 3"/>
+      <w:rFonts w:asciiTheme="majorHAnsi" w:eastAsiaTheme="majorEastAsia" w:hAnsiTheme="majorHAnsi" w:cstheme="majorBidi" w:ascii="Arial" w:hAnsi="Arial"/>
+      <w:color w:val="000000"/>
+      <w:sz w:val="26"/>
+      <w:szCs w:val="32"/>
+    </w:rPr>
+  </w:style>
+  <w:style w:type="paragraph" w:styleId="Heading3">
+    <w:name w:val="heading 3"/>
     <w:basedOn w:val="Normal"/>
     <w:next w:val="BodyText"/>
+    <w:link w:val="Heading3Char"/>
     <w:uiPriority w:val="9"/>
+    <w:semiHidden/>
     <w:unhideWhenUsed/>
     <w:qFormat/>
+    <w:rsid w:val="00A10FD9"/>
     <w:pPr>
       <w:keepNext/>
       <w:keepLines/>
-      <w:spacing w:after="0" w:before="200"/>
+      <w:spacing w:before="280" w:after="140"/>
       <w:outlineLvl w:val="2"/>
     </w:pPr>
     <w:rPr>
-      <w:rFonts w:asciiTheme="majorHAnsi" w:cstheme="majorBidi" w:eastAsiaTheme="majorEastAsia" w:hAnsiTheme="majorHAnsi"/>
-      <w:b/>
-      <w:bCs/>
-      <w:color w:themeColor="accent1" w:val="4F81BD"/>
-      <w:sz w:val="24"/>
-      <w:szCs w:val="24"/>
-    </w:rPr>
-  </w:style>
-  <w:style w:styleId="Heading4" w:type="paragraph">
-    <w:name w:val="Heading 4"/>
+      <w:rFonts w:eastAsiaTheme="majorEastAsia" w:cstheme="majorBidi" w:ascii="Arial" w:hAnsi="Arial"/>
+      <w:color w:val="000000"/>
+      <w:sz w:val="22"/>
+      <w:szCs w:val="28"/>
+    </w:rPr>
+  </w:style>
+  <w:style w:type="paragraph" w:styleId="Heading4">
+    <w:name w:val="heading 4"/>
     <w:basedOn w:val="Normal"/>
     <w:next w:val="BodyText"/>
+    <w:link w:val="Heading4Char"/>
     <w:uiPriority w:val="9"/>
+    <w:semiHidden/>
     <w:unhideWhenUsed/>
     <w:qFormat/>
+    <w:rsid w:val="00A10FD9"/>
     <w:pPr>
       <w:keepNext/>
       <w:keepLines/>
-      <w:spacing w:after="0" w:before="200"/>
+      <w:spacing w:before="80" w:after="40"/>
       <w:outlineLvl w:val="3"/>
     </w:pPr>
     <w:rPr>
-      <w:rFonts w:asciiTheme="majorHAnsi" w:cstheme="majorBidi" w:eastAsiaTheme="majorEastAsia" w:hAnsiTheme="majorHAnsi"/>
-      <w:bCs/>
+      <w:rFonts w:eastAsiaTheme="majorEastAsia" w:cstheme="majorBidi"/>
       <w:i/>
-      <w:color w:themeColor="accent1" w:val="4F81BD"/>
-      <w:sz w:val="24"/>
-      <w:szCs w:val="24"/>
-    </w:rPr>
-  </w:style>
-  <w:style w:styleId="Heading5" w:type="paragraph">
-    <w:name w:val="Heading 5"/>
+      <w:iCs/>
+      <w:color w:val="0F4761" w:themeColor="accent1" w:themeShade="BF"/>
+    </w:rPr>
+  </w:style>
+  <w:style w:type="paragraph" w:styleId="Heading5">
+    <w:name w:val="heading 5"/>
     <w:basedOn w:val="Normal"/>
     <w:next w:val="BodyText"/>
+    <w:link w:val="Heading5Char"/>
     <w:uiPriority w:val="9"/>
+    <w:semiHidden/>
     <w:unhideWhenUsed/>
     <w:qFormat/>
+    <w:rsid w:val="00A10FD9"/>
     <w:pPr>
       <w:keepNext/>
       <w:keepLines/>
-      <w:spacing w:after="0" w:before="200"/>
+      <w:spacing w:before="80" w:after="40"/>
       <w:outlineLvl w:val="4"/>
     </w:pPr>
     <w:rPr>
-      <w:rFonts w:asciiTheme="majorHAnsi" w:cstheme="majorBidi" w:eastAsiaTheme="majorEastAsia" w:hAnsiTheme="majorHAnsi"/>
-      <w:iCs/>
-      <w:color w:themeColor="accent1" w:val="4F81BD"/>
-      <w:sz w:val="24"/>
-      <w:szCs w:val="24"/>
-    </w:rPr>
-  </w:style>
-  <w:style w:styleId="Heading6" w:type="paragraph">
-    <w:name w:val="Heading 6"/>
+      <w:rFonts w:eastAsiaTheme="majorEastAsia" w:cstheme="majorBidi"/>
+      <w:color w:val="0F4761" w:themeColor="accent1" w:themeShade="BF"/>
+    </w:rPr>
+  </w:style>
+  <w:style w:type="paragraph" w:styleId="Heading6">
+    <w:name w:val="heading 6"/>
     <w:basedOn w:val="Normal"/>
     <w:next w:val="BodyText"/>
+    <w:link w:val="Heading6Char"/>
     <w:uiPriority w:val="9"/>
+    <w:semiHidden/>
     <w:unhideWhenUsed/>
     <w:qFormat/>
+    <w:rsid w:val="00A10FD9"/>
     <w:pPr>
       <w:keepNext/>
       <w:keepLines/>
-      <w:spacing w:after="0" w:before="200"/>
+      <w:spacing w:before="40" w:after="0"/>
       <w:outlineLvl w:val="5"/>
     </w:pPr>
     <w:rPr>
-      <w:rFonts w:asciiTheme="majorHAnsi" w:cstheme="majorBidi" w:eastAsiaTheme="majorEastAsia" w:hAnsiTheme="majorHAnsi"/>
-      <w:color w:themeColor="accent1" w:val="4F81BD"/>
-      <w:sz w:val="24"/>
-      <w:szCs w:val="24"/>
-    </w:rPr>
-  </w:style>
-  <w:style w:styleId="Heading7" w:type="paragraph">
-    <w:name w:val="Heading 7"/>
+      <w:rFonts w:eastAsiaTheme="majorEastAsia" w:cstheme="majorBidi"/>
+      <w:i/>
+      <w:iCs/>
+      <w:color w:val="595959" w:themeColor="text1" w:themeTint="A6"/>
+    </w:rPr>
+  </w:style>
+  <w:style w:type="paragraph" w:styleId="Heading7">
+    <w:name w:val="heading 7"/>
     <w:basedOn w:val="Normal"/>
     <w:next w:val="BodyText"/>
+    <w:link w:val="Heading7Char"/>
     <w:uiPriority w:val="9"/>
+    <w:semiHidden/>
     <w:unhideWhenUsed/>
     <w:qFormat/>
+    <w:rsid w:val="00A10FD9"/>
     <w:pPr>
       <w:keepNext/>
       <w:keepLines/>
-      <w:spacing w:after="0" w:before="200"/>
+      <w:spacing w:before="40" w:after="0"/>
       <w:outlineLvl w:val="6"/>
     </w:pPr>
     <w:rPr>
-      <w:rFonts w:asciiTheme="majorHAnsi" w:cstheme="majorBidi" w:eastAsiaTheme="majorEastAsia" w:hAnsiTheme="majorHAnsi"/>
-      <w:color w:themeColor="accent1" w:val="4F81BD"/>
-      <w:sz w:val="24"/>
-      <w:szCs w:val="24"/>
-    </w:rPr>
-  </w:style>
-  <w:style w:styleId="Heading8" w:type="paragraph">
-    <w:name w:val="Heading 8"/>
+      <w:rFonts w:eastAsiaTheme="majorEastAsia" w:cstheme="majorBidi"/>
+      <w:color w:val="595959" w:themeColor="text1" w:themeTint="A6"/>
+    </w:rPr>
+  </w:style>
+  <w:style w:type="paragraph" w:styleId="Heading8">
+    <w:name w:val="heading 8"/>
     <w:basedOn w:val="Normal"/>
     <w:next w:val="BodyText"/>
+    <w:link w:val="Heading8Char"/>
     <w:uiPriority w:val="9"/>
+    <w:semiHidden/>
     <w:unhideWhenUsed/>
     <w:qFormat/>
+    <w:rsid w:val="00A10FD9"/>
     <w:pPr>
       <w:keepNext/>
       <w:keepLines/>
-      <w:spacing w:after="0" w:before="200"/>
+      <w:spacing w:after="0"/>
       <w:outlineLvl w:val="7"/>
     </w:pPr>
     <w:rPr>
-      <w:rFonts w:asciiTheme="majorHAnsi" w:cstheme="majorBidi" w:eastAsiaTheme="majorEastAsia" w:hAnsiTheme="majorHAnsi"/>
-      <w:color w:themeColor="accent1" w:val="4F81BD"/>
-      <w:sz w:val="24"/>
-      <w:szCs w:val="24"/>
-    </w:rPr>
-  </w:style>
-  <w:style w:styleId="Heading9" w:type="paragraph">
-    <w:name w:val="Heading 9"/>
+      <w:rFonts w:eastAsiaTheme="majorEastAsia" w:cstheme="majorBidi"/>
+      <w:i/>
+      <w:iCs/>
+      <w:color w:val="272727" w:themeColor="text1" w:themeTint="D8"/>
+    </w:rPr>
+  </w:style>
+  <w:style w:type="paragraph" w:styleId="Heading9">
+    <w:name w:val="heading 9"/>
     <w:basedOn w:val="Normal"/>
     <w:next w:val="BodyText"/>
+    <w:link w:val="Heading9Char"/>
     <w:uiPriority w:val="9"/>
+    <w:semiHidden/>
     <w:unhideWhenUsed/>
     <w:qFormat/>
+    <w:rsid w:val="00A10FD9"/>
     <w:pPr>
       <w:keepNext/>
       <w:keepLines/>
-      <w:spacing w:after="0" w:before="200"/>
+      <w:spacing w:after="0"/>
       <w:outlineLvl w:val="8"/>
     </w:pPr>
     <w:rPr>
-      <w:rFonts w:asciiTheme="majorHAnsi" w:cstheme="majorBidi" w:eastAsiaTheme="majorEastAsia" w:hAnsiTheme="majorHAnsi"/>
-      <w:color w:themeColor="accent1" w:val="4F81BD"/>
-      <w:sz w:val="24"/>
-      <w:szCs w:val="24"/>
-    </w:rPr>
-  </w:style>
-  <w:style w:styleId="BlockText" w:type="paragraph">
+      <w:rFonts w:eastAsiaTheme="majorEastAsia" w:cstheme="majorBidi"/>
+      <w:color w:val="272727" w:themeColor="text1" w:themeTint="D8"/>
+    </w:rPr>
+  </w:style>
+  <w:style w:type="character" w:customStyle="1" w:styleId="Heading1Char">
+    <w:name w:val="Heading 1 Char"/>
+    <w:basedOn w:val="DefaultParagraphFont"/>
+    <w:link w:val="Heading1"/>
+    <w:uiPriority w:val="9"/>
+    <w:rsid w:val="00A10FD9"/>
+    <w:rPr>
+      <w:rFonts w:asciiTheme="majorHAnsi" w:eastAsiaTheme="majorEastAsia" w:hAnsiTheme="majorHAnsi" w:cstheme="majorBidi"/>
+      <w:color w:val="0F4761" w:themeColor="accent1" w:themeShade="BF"/>
+      <w:sz w:val="40"/>
+      <w:szCs w:val="40"/>
+    </w:rPr>
+  </w:style>
+  <w:style w:type="character" w:customStyle="1" w:styleId="Heading2Char">
+    <w:name w:val="Heading 2 Char"/>
+    <w:basedOn w:val="DefaultParagraphFont"/>
+    <w:link w:val="Heading2"/>
+    <w:uiPriority w:val="9"/>
+    <w:semiHidden/>
+    <w:rsid w:val="00A10FD9"/>
+    <w:rPr>
+      <w:rFonts w:asciiTheme="majorHAnsi" w:eastAsiaTheme="majorEastAsia" w:hAnsiTheme="majorHAnsi" w:cstheme="majorBidi"/>
+      <w:color w:val="0F4761" w:themeColor="accent1" w:themeShade="BF"/>
+      <w:sz w:val="32"/>
+      <w:szCs w:val="32"/>
+    </w:rPr>
+  </w:style>
+  <w:style w:type="character" w:customStyle="1" w:styleId="Heading3Char">
+    <w:name w:val="Heading 3 Char"/>
+    <w:basedOn w:val="DefaultParagraphFont"/>
+    <w:link w:val="Heading3"/>
+    <w:uiPriority w:val="9"/>
+    <w:semiHidden/>
+    <w:rsid w:val="00A10FD9"/>
+    <w:rPr>
+      <w:rFonts w:eastAsiaTheme="majorEastAsia" w:cstheme="majorBidi"/>
+      <w:color w:val="0F4761" w:themeColor="accent1" w:themeShade="BF"/>
+      <w:sz w:val="28"/>
+      <w:szCs w:val="28"/>
+    </w:rPr>
+  </w:style>
+  <w:style w:type="character" w:customStyle="1" w:styleId="Heading4Char">
+    <w:name w:val="Heading 4 Char"/>
+    <w:basedOn w:val="DefaultParagraphFont"/>
+    <w:link w:val="Heading4"/>
+    <w:uiPriority w:val="9"/>
+    <w:semiHidden/>
+    <w:rsid w:val="00A10FD9"/>
+    <w:rPr>
+      <w:rFonts w:eastAsiaTheme="majorEastAsia" w:cstheme="majorBidi"/>
+      <w:i/>
+      <w:iCs/>
+      <w:color w:val="0F4761" w:themeColor="accent1" w:themeShade="BF"/>
+    </w:rPr>
+  </w:style>
+  <w:style w:type="character" w:customStyle="1" w:styleId="Heading5Char">
+    <w:name w:val="Heading 5 Char"/>
+    <w:basedOn w:val="DefaultParagraphFont"/>
+    <w:link w:val="Heading5"/>
+    <w:uiPriority w:val="9"/>
+    <w:semiHidden/>
+    <w:rsid w:val="00A10FD9"/>
+    <w:rPr>
+      <w:rFonts w:eastAsiaTheme="majorEastAsia" w:cstheme="majorBidi"/>
+      <w:color w:val="0F4761" w:themeColor="accent1" w:themeShade="BF"/>
+    </w:rPr>
+  </w:style>
+  <w:style w:type="character" w:customStyle="1" w:styleId="Heading6Char">
+    <w:name w:val="Heading 6 Char"/>
+    <w:basedOn w:val="DefaultParagraphFont"/>
+    <w:link w:val="Heading6"/>
+    <w:uiPriority w:val="9"/>
+    <w:semiHidden/>
+    <w:rsid w:val="00A10FD9"/>
+    <w:rPr>
+      <w:rFonts w:eastAsiaTheme="majorEastAsia" w:cstheme="majorBidi"/>
+      <w:i/>
+      <w:iCs/>
+      <w:color w:val="595959" w:themeColor="text1" w:themeTint="A6"/>
+    </w:rPr>
+  </w:style>
+  <w:style w:type="character" w:customStyle="1" w:styleId="Heading7Char">
+    <w:name w:val="Heading 7 Char"/>
+    <w:basedOn w:val="DefaultParagraphFont"/>
+    <w:link w:val="Heading7"/>
+    <w:uiPriority w:val="9"/>
+    <w:semiHidden/>
+    <w:rsid w:val="00A10FD9"/>
+    <w:rPr>
+      <w:rFonts w:eastAsiaTheme="majorEastAsia" w:cstheme="majorBidi"/>
+      <w:color w:val="595959" w:themeColor="text1" w:themeTint="A6"/>
+    </w:rPr>
+  </w:style>
+  <w:style w:type="character" w:customStyle="1" w:styleId="Heading8Char">
+    <w:name w:val="Heading 8 Char"/>
+    <w:basedOn w:val="DefaultParagraphFont"/>
+    <w:link w:val="Heading8"/>
+    <w:uiPriority w:val="9"/>
+    <w:semiHidden/>
+    <w:rsid w:val="00A10FD9"/>
+    <w:rPr>
+      <w:rFonts w:eastAsiaTheme="majorEastAsia" w:cstheme="majorBidi"/>
+      <w:i/>
+      <w:iCs/>
+      <w:color w:val="272727" w:themeColor="text1" w:themeTint="D8"/>
+    </w:rPr>
+  </w:style>
+  <w:style w:type="character" w:customStyle="1" w:styleId="Heading9Char">
+    <w:name w:val="Heading 9 Char"/>
+    <w:basedOn w:val="DefaultParagraphFont"/>
+    <w:link w:val="Heading9"/>
+    <w:uiPriority w:val="9"/>
+    <w:semiHidden/>
+    <w:rsid w:val="00A10FD9"/>
+    <w:rPr>
+      <w:rFonts w:eastAsiaTheme="majorEastAsia" w:cstheme="majorBidi"/>
+      <w:color w:val="272727" w:themeColor="text1" w:themeTint="D8"/>
+    </w:rPr>
+  </w:style>
+  <w:style w:type="paragraph" w:styleId="BlockText">
     <w:name w:val="Block Text"/>
     <w:basedOn w:val="BodyText"/>
     <w:next w:val="BodyText"/>
@@ -2456,11 +3254,11 @@
     <w:unhideWhenUsed/>
     <w:qFormat/>
     <w:pPr>
-      <w:spacing w:after="100" w:before="100"/>
+      <w:spacing w:before="100" w:after="100"/>
       <w:ind w:firstLine="0" w:left="480" w:right="480"/>
     </w:pPr>
   </w:style>
-  <w:style w:styleId="FootnoteText" w:type="paragraph">
+  <w:style w:type="paragraph" w:styleId="FootnoteText">
     <w:name w:val="Footnote Text"/>
     <w:basedOn w:val="Normal"/>
     <w:next w:val="FootnoteText"/>
@@ -2468,46 +3266,37 @@
     <w:unhideWhenUsed/>
     <w:qFormat/>
   </w:style>
-  <w:style w:styleId="FootnoteBlockText" w:type="paragraph">
+  <w:style w:type="paragraph" w:styleId="FootnoteBlockText">
     <w:name w:val="Footnote Block Text"/>
-    <w:basedOn w:val="Footnote Text"/>
-    <w:next w:val="Footnote Text"/>
+    <w:basedOn w:val="FootnoteText"/>
+    <w:next w:val="FootnoteText"/>
     <w:uiPriority w:val="9"/>
     <w:unhideWhenUsed/>
     <w:qFormat/>
     <w:pPr>
-      <w:spacing w:after="100" w:before="100"/>
+      <w:spacing w:before="100" w:after="100"/>
       <w:ind w:firstLine="0" w:left="480" w:right="480"/>
     </w:pPr>
   </w:style>
-  <w:style w:default="1" w:styleId="DefaultParagraphFont" w:type="character">
+  <w:style w:type="character" w:default="1" w:styleId="DefaultParagraphFont">
     <w:name w:val="Default Paragraph Font"/>
     <w:semiHidden/>
     <w:unhideWhenUsed/>
   </w:style>
-  <w:style w:default="1" w:styleId="Table" w:type="table">
+  <w:style w:type="table" w:default="1" w:styleId="Table">
     <w:name w:val="Table"/>
     <w:basedOn w:val="TableNormal"/>
-    <w:semiHidden/>
-    <w:unhideWhenUsed/>
     <w:qFormat/>
     <w:tblPr>
-      <w:tblInd w:type="dxa" w:w="0"/>
+      <w:tblInd w:w="0" w:type="dxa"/>
       <w:tblCellMar>
-        <w:top w:type="dxa" w:w="0"/>
-        <w:left w:type="dxa" w:w="108"/>
-        <w:bottom w:type="dxa" w:w="0"/>
-        <w:right w:type="dxa" w:w="108"/>
+        <w:top w:w="0" w:type="dxa"/>
+        <w:left w:w="108" w:type="dxa"/>
+        <w:bottom w:w="0" w:type="dxa"/>
+        <w:right w:w="108" w:type="dxa"/>
       </w:tblCellMar>
     </w:tblPr>
     <w:tblStylePr w:type="firstRow">
-      <w:tblPr>
-        <w:jc w:val="left"/>
-        <w:tblInd w:type="dxa" w:w="0"/>
-      </w:tblPr>
-      <w:trPr>
-        <w:jc w:val="left"/>
-      </w:trPr>
       <w:tcPr>
         <w:tcBorders>
           <w:bottom w:val="single"/>
@@ -2516,7 +3305,7 @@
       </w:tcPr>
     </w:tblStylePr>
   </w:style>
-  <w:style w:customStyle="1" w:styleId="DefinitionTerm" w:type="paragraph">
+  <w:style w:type="paragraph" w:customStyle="1" w:styleId="DefinitionTerm">
     <w:name w:val="Definition Term"/>
     <w:basedOn w:val="Normal"/>
     <w:next w:val="Definition"/>
@@ -2529,49 +3318,49 @@
       <w:b/>
     </w:rPr>
   </w:style>
-  <w:style w:customStyle="1" w:styleId="Definition" w:type="paragraph">
+  <w:style w:type="paragraph" w:customStyle="1" w:styleId="Definition">
     <w:name w:val="Definition"/>
     <w:basedOn w:val="Normal"/>
   </w:style>
-  <w:style w:styleId="Caption" w:type="paragraph">
+  <w:style w:type="paragraph" w:styleId="Caption">
     <w:name w:val="Caption"/>
     <w:basedOn w:val="Normal"/>
     <w:link w:val="BodyTextChar"/>
     <w:pPr>
-      <w:spacing w:after="120" w:before="0"/>
+      <w:spacing w:before="0" w:after="120"/>
     </w:pPr>
     <w:rPr>
       <w:i/>
     </w:rPr>
   </w:style>
-  <w:style w:customStyle="1" w:styleId="TableCaption" w:type="paragraph">
+  <w:style w:type="paragraph" w:customStyle="1" w:styleId="TableCaption">
     <w:name w:val="Table Caption"/>
     <w:basedOn w:val="Caption"/>
     <w:pPr>
       <w:keepNext/>
     </w:pPr>
   </w:style>
-  <w:style w:customStyle="1" w:styleId="ImageCaption" w:type="paragraph">
+  <w:style w:type="paragraph" w:customStyle="1" w:styleId="ImageCaption">
     <w:name w:val="Image Caption"/>
     <w:basedOn w:val="Caption"/>
   </w:style>
-  <w:style w:customStyle="1" w:styleId="Figure" w:type="paragraph">
+  <w:style w:type="paragraph" w:customStyle="1" w:styleId="Figure">
     <w:name w:val="Figure"/>
     <w:basedOn w:val="Normal"/>
   </w:style>
-  <w:style w:customStyle="1" w:styleId="CaptionedFigure" w:type="paragraph">
+  <w:style w:type="paragraph" w:customStyle="1" w:styleId="CaptionedFigure">
     <w:name w:val="Captioned Figure"/>
     <w:basedOn w:val="Figure"/>
     <w:pPr>
       <w:keepNext/>
     </w:pPr>
   </w:style>
-  <w:style w:customStyle="1" w:styleId="BodyTextChar" w:type="character">
+  <w:style w:type="character" w:customStyle="1" w:styleId="BodyTextChar">
     <w:name w:val="Body Text Char"/>
     <w:basedOn w:val="DefaultParagraphFont"/>
     <w:link w:val="BodyText"/>
   </w:style>
-  <w:style w:customStyle="1" w:styleId="VerbatimChar" w:type="character">
+  <w:style w:type="character" w:customStyle="1" w:styleId="VerbatimChar">
     <w:name w:val="Verbatim Char"/>
     <w:basedOn w:val="BodyTextChar"/>
     <w:rPr>
@@ -2579,25 +3368,25 @@
       <w:sz w:val="22"/>
     </w:rPr>
   </w:style>
-  <w:style w:customStyle="1" w:styleId="SectionNumber" w:type="character">
+  <w:style w:type="character" w:customStyle="1" w:styleId="SectionNumber">
     <w:name w:val="Section Number"/>
     <w:basedOn w:val="BodyTextChar"/>
   </w:style>
-  <w:style w:styleId="FootnoteReference" w:type="character">
+  <w:style w:type="character" w:styleId="FootnoteReference">
     <w:name w:val="Footnote Reference"/>
     <w:basedOn w:val="BodyTextChar"/>
     <w:rPr>
       <w:vertAlign w:val="superscript"/>
     </w:rPr>
   </w:style>
-  <w:style w:styleId="Hyperlink" w:type="character">
+  <w:style w:type="character" w:styleId="Hyperlink">
     <w:name w:val="Hyperlink"/>
     <w:basedOn w:val="BodyTextChar"/>
     <w:rPr>
-      <w:color w:themeColor="accent1" w:val="4F81BD"/>
-    </w:rPr>
-  </w:style>
-  <w:style w:styleId="TOCHeading" w:type="paragraph">
+      <w:color w:val="4F81BD" w:themeColor="accent1"/>
+    </w:rPr>
+  </w:style>
+  <w:style w:type="paragraph" w:styleId="TOCHeading">
     <w:name w:val="TOC Heading"/>
     <w:basedOn w:val="Heading1"/>
     <w:next w:val="BodyText"/>
@@ -2609,10 +3398,10 @@
       <w:outlineLvl w:val="9"/>
     </w:pPr>
     <w:rPr>
-      <w:rFonts w:asciiTheme="majorHAnsi" w:cstheme="majorBidi" w:eastAsiaTheme="majorEastAsia" w:hAnsiTheme="majorHAnsi"/>
+      <w:rFonts w:asciiTheme="majorHAnsi" w:eastAsiaTheme="majorEastAsia" w:hAnsiTheme="majorHAnsi" w:cstheme="majorBidi"/>
       <w:b w:val="0"/>
       <w:bCs w:val="0"/>
-      <w:color w:themeColor="accent1" w:themeShade="BF" w:val="365F91"/>
+      <w:color w:val="365F91" w:themeColor="accent1" w:themeShade="BF"/>
     </w:rPr>
   </w:style>
   <w:style w:type="paragraph" w:customStyle="1" w:styleId="SourceCode">
@@ -2863,44 +3652,44 @@
         <a:sysClr val="window" lastClr="FFFFFF"/>
       </a:lt1>
       <a:dk2>
-        <a:srgbClr val="1F497D"/>
+        <a:srgbClr val="0E2841"/>
       </a:dk2>
       <a:lt2>
-        <a:srgbClr val="EEECE1"/>
+        <a:srgbClr val="E8E8E8"/>
       </a:lt2>
       <a:accent1>
-        <a:srgbClr val="4F81BD"/>
+        <a:srgbClr val="156082"/>
       </a:accent1>
       <a:accent2>
-        <a:srgbClr val="C0504D"/>
+        <a:srgbClr val="E97132"/>
       </a:accent2>
       <a:accent3>
-        <a:srgbClr val="9BBB59"/>
+        <a:srgbClr val="196B24"/>
       </a:accent3>
       <a:accent4>
-        <a:srgbClr val="8064A2"/>
+        <a:srgbClr val="0F9ED5"/>
       </a:accent4>
       <a:accent5>
-        <a:srgbClr val="4BACC6"/>
+        <a:srgbClr val="A02B93"/>
       </a:accent5>
       <a:accent6>
-        <a:srgbClr val="F79646"/>
+        <a:srgbClr val="4EA72E"/>
       </a:accent6>
       <a:hlink>
-        <a:srgbClr val="0000FF"/>
+        <a:srgbClr val="467886"/>
       </a:hlink>
       <a:folHlink>
-        <a:srgbClr val="800080"/>
+        <a:srgbClr val="96607D"/>
       </a:folHlink>
     </a:clrScheme>
     <a:fontScheme name="Office">
       <a:majorFont>
-        <a:latin typeface="Calibri"/>
+        <a:latin typeface="Aptos Display" panose="02110004020202020204"/>
         <a:ea typeface=""/>
         <a:cs typeface=""/>
-        <a:font script="Jpan" typeface="ＭＳ ゴシック"/>
+        <a:font script="Jpan" typeface="游ゴシック Light"/>
         <a:font script="Hang" typeface="맑은 고딕"/>
-        <a:font script="Hans" typeface="宋体"/>
+        <a:font script="Hans" typeface="等线 Light"/>
         <a:font script="Hant" typeface="新細明體"/>
         <a:font script="Arab" typeface="Times New Roman"/>
         <a:font script="Hebr" typeface="Times New Roman"/>
@@ -2927,14 +3716,32 @@
         <a:font script="Mong" typeface="Mongolian Baiti"/>
         <a:font script="Viet" typeface="Times New Roman"/>
         <a:font script="Uigh" typeface="Microsoft Uighur"/>
+        <a:font script="Geor" typeface="Sylfaen"/>
+        <a:font script="Armn" typeface="Arial"/>
+        <a:font script="Bugi" typeface="Leelawadee UI"/>
+        <a:font script="Bopo" typeface="Microsoft JhengHei"/>
+        <a:font script="Java" typeface="Javanese Text"/>
+        <a:font script="Lisu" typeface="Segoe UI"/>
+        <a:font script="Mymr" typeface="Myanmar Text"/>
+        <a:font script="Nkoo" typeface="Ebrima"/>
+        <a:font script="Olck" typeface="Nirmala UI"/>
+        <a:font script="Osma" typeface="Ebrima"/>
+        <a:font script="Phag" typeface="Phagspa"/>
+        <a:font script="Syrn" typeface="Estrangelo Edessa"/>
+        <a:font script="Syrj" typeface="Estrangelo Edessa"/>
+        <a:font script="Syre" typeface="Estrangelo Edessa"/>
+        <a:font script="Sora" typeface="Nirmala UI"/>
+        <a:font script="Tale" typeface="Microsoft Tai Le"/>
+        <a:font script="Talu" typeface="Microsoft New Tai Lue"/>
+        <a:font script="Tfng" typeface="Ebrima"/>
       </a:majorFont>
       <a:minorFont>
-        <a:latin typeface="Cambria"/>
+        <a:latin typeface="Aptos" panose="02110004020202020204"/>
         <a:ea typeface=""/>
         <a:cs typeface=""/>
-        <a:font script="Jpan" typeface="ＭＳ 明朝"/>
+        <a:font script="Jpan" typeface="游明朝"/>
         <a:font script="Hang" typeface="맑은 고딕"/>
-        <a:font script="Hans" typeface="宋体"/>
+        <a:font script="Hans" typeface="等线"/>
         <a:font script="Hant" typeface="新細明體"/>
         <a:font script="Arab" typeface="Arial"/>
         <a:font script="Hebr" typeface="Arial"/>
@@ -2961,6 +3768,24 @@
         <a:font script="Mong" typeface="Mongolian Baiti"/>
         <a:font script="Viet" typeface="Arial"/>
         <a:font script="Uigh" typeface="Microsoft Uighur"/>
+        <a:font script="Geor" typeface="Sylfaen"/>
+        <a:font script="Armn" typeface="Arial"/>
+        <a:font script="Bugi" typeface="Leelawadee UI"/>
+        <a:font script="Bopo" typeface="Microsoft JhengHei"/>
+        <a:font script="Java" typeface="Javanese Text"/>
+        <a:font script="Lisu" typeface="Segoe UI"/>
+        <a:font script="Mymr" typeface="Myanmar Text"/>
+        <a:font script="Nkoo" typeface="Ebrima"/>
+        <a:font script="Olck" typeface="Nirmala UI"/>
+        <a:font script="Osma" typeface="Ebrima"/>
+        <a:font script="Phag" typeface="Phagspa"/>
+        <a:font script="Syrn" typeface="Estrangelo Edessa"/>
+        <a:font script="Syrj" typeface="Estrangelo Edessa"/>
+        <a:font script="Syre" typeface="Estrangelo Edessa"/>
+        <a:font script="Sora" typeface="Nirmala UI"/>
+        <a:font script="Tale" typeface="Microsoft Tai Le"/>
+        <a:font script="Talu" typeface="Microsoft New Tai Lue"/>
+        <a:font script="Tfng" typeface="Ebrima"/>
       </a:minorFont>
     </a:fontScheme>
     <a:fmtScheme name="Office">
@@ -2972,200 +3797,141 @@
           <a:gsLst>
             <a:gs pos="0">
               <a:schemeClr val="phClr">
-                <a:tint val="50000"/>
-                <a:satMod val="300000"/>
+                <a:lumMod val="110000"/>
+                <a:satMod val="105000"/>
+                <a:tint val="67000"/>
               </a:schemeClr>
             </a:gs>
-            <a:gs pos="35000">
+            <a:gs pos="50000">
               <a:schemeClr val="phClr">
-                <a:tint val="37000"/>
-                <a:satMod val="300000"/>
+                <a:lumMod val="105000"/>
+                <a:satMod val="103000"/>
+                <a:tint val="73000"/>
               </a:schemeClr>
             </a:gs>
             <a:gs pos="100000">
               <a:schemeClr val="phClr">
-                <a:tint val="15000"/>
-                <a:satMod val="350000"/>
+                <a:lumMod val="105000"/>
+                <a:satMod val="109000"/>
+                <a:tint val="81000"/>
               </a:schemeClr>
             </a:gs>
           </a:gsLst>
-          <a:lin ang="16200000" scaled="1"/>
+          <a:lin ang="5400000" scaled="0"/>
         </a:gradFill>
         <a:gradFill rotWithShape="1">
           <a:gsLst>
             <a:gs pos="0">
               <a:schemeClr val="phClr">
-                <a:tint val="100000"/>
+                <a:satMod val="103000"/>
+                <a:lumMod val="102000"/>
+                <a:tint val="94000"/>
+              </a:schemeClr>
+            </a:gs>
+            <a:gs pos="50000">
+              <a:schemeClr val="phClr">
+                <a:satMod val="110000"/>
+                <a:lumMod val="100000"/>
                 <a:shade val="100000"/>
-                <a:satMod val="130000"/>
               </a:schemeClr>
             </a:gs>
             <a:gs pos="100000">
               <a:schemeClr val="phClr">
-                <a:tint val="50000"/>
-                <a:shade val="100000"/>
-                <a:satMod val="350000"/>
+                <a:lumMod val="99000"/>
+                <a:satMod val="120000"/>
+                <a:shade val="78000"/>
               </a:schemeClr>
             </a:gs>
           </a:gsLst>
-          <a:lin ang="16200000" scaled="0"/>
+          <a:lin ang="5400000" scaled="0"/>
         </a:gradFill>
       </a:fillStyleLst>
       <a:lnStyleLst>
-        <a:ln w="9525" cap="flat" cmpd="sng" algn="ctr">
-          <a:solidFill>
-            <a:schemeClr val="phClr">
-              <a:shade val="95000"/>
-              <a:satMod val="105000"/>
-            </a:schemeClr>
-          </a:solidFill>
-          <a:prstDash val="solid"/>
-        </a:ln>
-        <a:ln w="25400" cap="flat" cmpd="sng" algn="ctr">
+        <a:ln w="6350" cap="flat" cmpd="sng" algn="ctr">
           <a:solidFill>
             <a:schemeClr val="phClr"/>
           </a:solidFill>
           <a:prstDash val="solid"/>
+          <a:miter lim="800000"/>
         </a:ln>
-        <a:ln w="38100" cap="flat" cmpd="sng" algn="ctr">
+        <a:ln w="12700" cap="flat" cmpd="sng" algn="ctr">
           <a:solidFill>
             <a:schemeClr val="phClr"/>
           </a:solidFill>
           <a:prstDash val="solid"/>
+          <a:miter lim="800000"/>
+        </a:ln>
+        <a:ln w="19050" cap="flat" cmpd="sng" algn="ctr">
+          <a:solidFill>
+            <a:schemeClr val="phClr"/>
+          </a:solidFill>
+          <a:prstDash val="solid"/>
+          <a:miter lim="800000"/>
         </a:ln>
       </a:lnStyleLst>
       <a:effectStyleLst>
         <a:effectStyle>
+          <a:effectLst/>
+        </a:effectStyle>
+        <a:effectStyle>
+          <a:effectLst/>
+        </a:effectStyle>
+        <a:effectStyle>
           <a:effectLst>
-            <a:outerShdw blurRad="40000" dist="20000" dir="5400000" rotWithShape="0">
+            <a:outerShdw blurRad="57150" dist="19050" dir="5400000" algn="ctr" rotWithShape="0">
               <a:srgbClr val="000000">
-                <a:alpha val="38000"/>
+                <a:alpha val="63000"/>
               </a:srgbClr>
             </a:outerShdw>
           </a:effectLst>
-        </a:effectStyle>
-        <a:effectStyle>
-          <a:effectLst>
-            <a:outerShdw blurRad="40000" dist="23000" dir="5400000" rotWithShape="0">
-              <a:srgbClr val="000000">
-                <a:alpha val="35000"/>
-              </a:srgbClr>
-            </a:outerShdw>
-          </a:effectLst>
-        </a:effectStyle>
-        <a:effectStyle>
-          <a:effectLst>
-            <a:outerShdw blurRad="40000" dist="23000" dir="5400000" rotWithShape="0">
-              <a:srgbClr val="000000">
-                <a:alpha val="35000"/>
-              </a:srgbClr>
-            </a:outerShdw>
-          </a:effectLst>
-          <a:scene3d>
-            <a:camera prst="orthographicFront">
-              <a:rot lat="0" lon="0" rev="0"/>
-            </a:camera>
-            <a:lightRig rig="threePt" dir="t">
-              <a:rot lat="0" lon="0" rev="1200000"/>
-            </a:lightRig>
-          </a:scene3d>
-          <a:sp3d>
-            <a:bevelT w="63500" h="25400"/>
-          </a:sp3d>
         </a:effectStyle>
       </a:effectStyleLst>
       <a:bgFillStyleLst>
         <a:solidFill>
           <a:schemeClr val="phClr"/>
         </a:solidFill>
+        <a:solidFill>
+          <a:schemeClr val="phClr">
+            <a:tint val="95000"/>
+            <a:satMod val="170000"/>
+          </a:schemeClr>
+        </a:solidFill>
         <a:gradFill rotWithShape="1">
           <a:gsLst>
             <a:gs pos="0">
               <a:schemeClr val="phClr">
-                <a:tint val="40000"/>
-                <a:satMod val="350000"/>
+                <a:tint val="93000"/>
+                <a:satMod val="150000"/>
+                <a:shade val="98000"/>
+                <a:lumMod val="102000"/>
               </a:schemeClr>
             </a:gs>
-            <a:gs pos="40000">
+            <a:gs pos="50000">
               <a:schemeClr val="phClr">
-                <a:tint val="45000"/>
-                <a:shade val="99000"/>
-                <a:satMod val="350000"/>
+                <a:tint val="98000"/>
+                <a:satMod val="130000"/>
+                <a:shade val="90000"/>
+                <a:lumMod val="103000"/>
               </a:schemeClr>
             </a:gs>
             <a:gs pos="100000">
               <a:schemeClr val="phClr">
-                <a:shade val="20000"/>
-                <a:satMod val="255000"/>
+                <a:shade val="63000"/>
+                <a:satMod val="120000"/>
               </a:schemeClr>
             </a:gs>
           </a:gsLst>
-          <a:path path="circle">
-            <a:fillToRect l="50000" t="-80000" r="50000" b="180000"/>
-          </a:path>
-        </a:gradFill>
-        <a:gradFill rotWithShape="1">
-          <a:gsLst>
-            <a:gs pos="0">
-              <a:schemeClr val="phClr">
-                <a:tint val="80000"/>
-                <a:satMod val="300000"/>
-              </a:schemeClr>
-            </a:gs>
-            <a:gs pos="100000">
-              <a:schemeClr val="phClr">
-                <a:shade val="30000"/>
-                <a:satMod val="200000"/>
-              </a:schemeClr>
-            </a:gs>
-          </a:gsLst>
-          <a:path path="circle">
-            <a:fillToRect l="50000" t="50000" r="50000" b="50000"/>
-          </a:path>
+          <a:lin ang="5400000" scaled="0"/>
         </a:gradFill>
       </a:bgFillStyleLst>
     </a:fmtScheme>
   </a:themeElements>
-  <a:objectDefaults>
-    <a:spDef>
-      <a:spPr/>
-      <a:bodyPr/>
-      <a:lstStyle/>
-      <a:style>
-        <a:lnRef idx="1">
-          <a:schemeClr val="accent1"/>
-        </a:lnRef>
-        <a:fillRef idx="3">
-          <a:schemeClr val="accent1"/>
-        </a:fillRef>
-        <a:effectRef idx="2">
-          <a:schemeClr val="accent1"/>
-        </a:effectRef>
-        <a:fontRef idx="minor">
-          <a:schemeClr val="lt1"/>
-        </a:fontRef>
-      </a:style>
-    </a:spDef>
-    <a:lnDef>
-      <a:spPr/>
-      <a:bodyPr/>
-      <a:lstStyle/>
-      <a:style>
-        <a:lnRef idx="2">
-          <a:schemeClr val="accent1"/>
-        </a:lnRef>
-        <a:fillRef idx="0">
-          <a:schemeClr val="accent1"/>
-        </a:fillRef>
-        <a:effectRef idx="1">
-          <a:schemeClr val="accent1"/>
-        </a:effectRef>
-        <a:fontRef idx="minor">
-          <a:schemeClr val="tx1"/>
-        </a:fontRef>
-      </a:style>
-    </a:lnDef>
-  </a:objectDefaults>
+  <a:objectDefaults/>
   <a:extraClrSchemeLst/>
+  <a:extLst>
+    <a:ext uri="{05A4C25C-085E-4340-85A3-A5531E510DB2}">
+      <thm15:themeFamily xmlns:thm15="http://schemas.microsoft.com/office/thememl/2012/main" name="Office Theme" id="{2E142A2C-CD16-42D6-873A-C26D2A0506FA}" vid="{1BDDFF52-6CD6-40A5-AB3C-68EB2F1E4D0A}"/>
+    </a:ext>
+  </a:extLst>
 </a:theme>
 </file>
</xml_diff>

<commit_message>
Polish PayLink walkthrough layout and refresh verified recording materials
</commit_message>
<xml_diff>
--- a/docs/database-design.docx
+++ b/docs/database-design.docx
@@ -50,6 +50,15 @@
       </w:r>
       <w:r>
         <w:t xml:space="preserve">. There are no real bank links, payment networks, withdrawals, fees, currency conversion, password recovery, or real account numbers. An account number is unique only within its bank. A bank routing number is globally unique in this model. A label is a property of the shared account, not a separate nickname per owner. All joint owners have equal spending permission. A transfer has exactly one source, one destination, and one initiating user. Only completed transfers are stored; a rejected transfer rolls back and is not represented as a completed or pending row.</w:t>
+      </w:r>
+    </w:p>
+    <w:p>
+      <w:pPr>
+        <w:pStyle w:val="BodyText"/>
+        <w:widowControl/>
+      </w:pPr>
+      <w:r>
+        <w:t xml:space="preserve">New profiles automatically receive a $200 checking account; the profile, account, and holder commit or roll back together. Additional accounts also open with $200, while existing balances are preserved.</w:t>
       </w:r>
     </w:p>
     <w:p>

</xml_diff>